<commit_message>
foi atualiazado o diretorio rede
</commit_message>
<xml_diff>
--- a/Redes/Roteamento Estático/Manual/Relatório do Projeto Serviço - Roteamento Estático.docx
+++ b/Redes/Roteamento Estático/Manual/Relatório do Projeto Serviço - Roteamento Estático.docx
@@ -1,7 +1,731 @@
 
 <file path=word/document.xml><?xml version="1.0" encoding="utf-8"?>
-<w:document xmlns:wpc="http://schemas.microsoft.com/office/word/2010/wordprocessingCanvas" xmlns:cx="http://schemas.microsoft.com/office/drawing/2014/chartex" xmlns:mc="http://schemas.openxmlformats.org/markup-compatibility/2006" xmlns:o="urn:schemas-microsoft-com:office:office" xmlns:r="http://schemas.openxmlformats.org/officeDocument/2006/relationships" xmlns:m="http://schemas.openxmlformats.org/officeDocument/2006/math" xmlns:v="urn:schemas-microsoft-com:vml" xmlns:wp14="http://schemas.microsoft.com/office/word/2010/wordprocessingDrawing" xmlns:wp="http://schemas.openxmlformats.org/drawingml/2006/wordprocessingDrawing" xmlns:w10="urn:schemas-microsoft-com:office:word" xmlns:w="http://schemas.openxmlformats.org/wordprocessingml/2006/main" xmlns:w14="http://schemas.microsoft.com/office/word/2010/wordml" xmlns:w15="http://schemas.microsoft.com/office/word/2012/wordml" xmlns:w16se="http://schemas.microsoft.com/office/word/2015/wordml/symex" xmlns:wpg="http://schemas.microsoft.com/office/word/2010/wordprocessingGroup" xmlns:wpi="http://schemas.microsoft.com/office/word/2010/wordprocessingInk" xmlns:wne="http://schemas.microsoft.com/office/word/2006/wordml" xmlns:wps="http://schemas.microsoft.com/office/word/2010/wordprocessingShape" mc:Ignorable="w14 w15 w16se wp14">
+<w:document xmlns:wpc="http://schemas.microsoft.com/office/word/2010/wordprocessingCanvas" xmlns:mc="http://schemas.openxmlformats.org/markup-compatibility/2006" xmlns:o="urn:schemas-microsoft-com:office:office" xmlns:r="http://schemas.openxmlformats.org/officeDocument/2006/relationships" xmlns:m="http://schemas.openxmlformats.org/officeDocument/2006/math" xmlns:v="urn:schemas-microsoft-com:vml" xmlns:wp14="http://schemas.microsoft.com/office/word/2010/wordprocessingDrawing" xmlns:wp="http://schemas.openxmlformats.org/drawingml/2006/wordprocessingDrawing" xmlns:w10="urn:schemas-microsoft-com:office:word" xmlns:w="http://schemas.openxmlformats.org/wordprocessingml/2006/main" xmlns:w14="http://schemas.microsoft.com/office/word/2010/wordml" xmlns:w15="http://schemas.microsoft.com/office/word/2012/wordml" xmlns:wpg="http://schemas.microsoft.com/office/word/2010/wordprocessingGroup" xmlns:wpi="http://schemas.microsoft.com/office/word/2010/wordprocessingInk" xmlns:wne="http://schemas.microsoft.com/office/word/2006/wordml" xmlns:wps="http://schemas.microsoft.com/office/word/2010/wordprocessingShape" mc:Ignorable="w14 w15 wp14">
   <w:body>
+    <w:p>
+      <w:pPr>
+        <w:spacing w:after="160" w:line="259" w:lineRule="auto"/>
+        <w:ind w:left="0" w:right="0" w:firstLine="0"/>
+        <w:jc w:val="left"/>
+        <w:rPr>
+          <w:b/>
+          <w:i/>
+          <w:sz w:val="40"/>
+        </w:rPr>
+      </w:pPr>
+      <w:r>
+        <w:rPr>
+          <w:b/>
+          <w:i/>
+          <w:noProof/>
+          <w:sz w:val="40"/>
+        </w:rPr>
+        <mc:AlternateContent>
+          <mc:Choice Requires="wps">
+            <w:drawing>
+              <wp:anchor distT="0" distB="0" distL="114300" distR="114300" simplePos="0" relativeHeight="251662336" behindDoc="0" locked="0" layoutInCell="1" allowOverlap="1" wp14:anchorId="6E7BECC7" wp14:editId="23379218">
+                <wp:simplePos x="0" y="0"/>
+                <wp:positionH relativeFrom="page">
+                  <wp:posOffset>360680</wp:posOffset>
+                </wp:positionH>
+                <wp:positionV relativeFrom="paragraph">
+                  <wp:posOffset>4466590</wp:posOffset>
+                </wp:positionV>
+                <wp:extent cx="7048500" cy="1543050"/>
+                <wp:effectExtent l="0" t="0" r="19050" b="19050"/>
+                <wp:wrapNone/>
+                <wp:docPr id="9" name="Caixa de texto 9"/>
+                <wp:cNvGraphicFramePr/>
+                <a:graphic xmlns:a="http://schemas.openxmlformats.org/drawingml/2006/main">
+                  <a:graphicData uri="http://schemas.microsoft.com/office/word/2010/wordprocessingShape">
+                    <wps:wsp>
+                      <wps:cNvSpPr txBox="1"/>
+                      <wps:spPr>
+                        <a:xfrm>
+                          <a:off x="0" y="0"/>
+                          <a:ext cx="7048500" cy="1543050"/>
+                        </a:xfrm>
+                        <a:prstGeom prst="rect">
+                          <a:avLst/>
+                        </a:prstGeom>
+                        <a:solidFill>
+                          <a:schemeClr val="lt1"/>
+                        </a:solidFill>
+                        <a:ln w="6350">
+                          <a:solidFill>
+                            <a:schemeClr val="bg1"/>
+                          </a:solidFill>
+                        </a:ln>
+                        <a:effectLst/>
+                      </wps:spPr>
+                      <wps:style>
+                        <a:lnRef idx="0">
+                          <a:schemeClr val="accent1"/>
+                        </a:lnRef>
+                        <a:fillRef idx="0">
+                          <a:schemeClr val="accent1"/>
+                        </a:fillRef>
+                        <a:effectRef idx="0">
+                          <a:schemeClr val="accent1"/>
+                        </a:effectRef>
+                        <a:fontRef idx="minor">
+                          <a:schemeClr val="dk1"/>
+                        </a:fontRef>
+                      </wps:style>
+                      <wps:txbx>
+                        <w:txbxContent>
+                          <w:p>
+                            <w:pPr>
+                              <w:jc w:val="center"/>
+                              <w:rPr>
+                                <w:b/>
+                                <w:sz w:val="40"/>
+                                <w:szCs w:val="32"/>
+                              </w:rPr>
+                            </w:pPr>
+                            <w:r>
+                              <w:rPr>
+                                <w:b/>
+                                <w:sz w:val="40"/>
+                                <w:szCs w:val="32"/>
+                              </w:rPr>
+                              <w:t>ROTEAMENTO ESTÁTICO</w:t>
+                            </w:r>
+                          </w:p>
+                          <w:p>
+                            <w:pPr>
+                              <w:jc w:val="center"/>
+                            </w:pPr>
+                            <w:r>
+                              <w:rPr>
+                                <w:sz w:val="32"/>
+                                <w:szCs w:val="30"/>
+                              </w:rPr>
+                              <w:t>CONFIGURAÇÃO DE UMA ROTA ESTÁTICA FLUTUANTE</w:t>
+                            </w:r>
+                          </w:p>
+                          <w:p>
+                            <w:pPr>
+                              <w:ind w:left="0"/>
+                            </w:pPr>
+                          </w:p>
+                        </w:txbxContent>
+                      </wps:txbx>
+                      <wps:bodyPr rot="0" spcFirstLastPara="0" vertOverflow="overflow" horzOverflow="overflow" vert="horz" wrap="square" lIns="91440" tIns="45720" rIns="91440" bIns="45720" numCol="1" spcCol="0" rtlCol="0" fromWordArt="0" anchor="t" anchorCtr="0" forceAA="0" compatLnSpc="1">
+                        <a:prstTxWarp prst="textNoShape">
+                          <a:avLst/>
+                        </a:prstTxWarp>
+                        <a:noAutofit/>
+                      </wps:bodyPr>
+                    </wps:wsp>
+                  </a:graphicData>
+                </a:graphic>
+                <wp14:sizeRelH relativeFrom="margin">
+                  <wp14:pctWidth>0</wp14:pctWidth>
+                </wp14:sizeRelH>
+              </wp:anchor>
+            </w:drawing>
+          </mc:Choice>
+          <mc:Fallback>
+            <w:pict>
+              <v:shapetype w14:anchorId="6E7BECC7" id="_x0000_t202" coordsize="21600,21600" o:spt="202" path="m,l,21600r21600,l21600,xe">
+                <v:stroke joinstyle="miter"/>
+                <v:path gradientshapeok="t" o:connecttype="rect"/>
+              </v:shapetype>
+              <v:shape id="Caixa de texto 9" o:spid="_x0000_s1026" type="#_x0000_t202" style="position:absolute;margin-left:28.4pt;margin-top:351.7pt;width:555pt;height:121.5pt;z-index:251662336;visibility:visible;mso-wrap-style:square;mso-width-percent:0;mso-wrap-distance-left:9pt;mso-wrap-distance-top:0;mso-wrap-distance-right:9pt;mso-wrap-distance-bottom:0;mso-position-horizontal:absolute;mso-position-horizontal-relative:page;mso-position-vertical:absolute;mso-position-vertical-relative:text;mso-width-percent:0;mso-width-relative:margin;v-text-anchor:top" o:gfxdata="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" fillcolor="white [3201]" strokecolor="white [3212]" strokeweight=".5pt">
+                <v:textbox>
+                  <w:txbxContent>
+                    <w:p>
+                      <w:pPr>
+                        <w:jc w:val="center"/>
+                        <w:rPr>
+                          <w:b/>
+                          <w:sz w:val="40"/>
+                          <w:szCs w:val="32"/>
+                        </w:rPr>
+                      </w:pPr>
+                      <w:r>
+                        <w:rPr>
+                          <w:b/>
+                          <w:sz w:val="40"/>
+                          <w:szCs w:val="32"/>
+                        </w:rPr>
+                        <w:t>ROTEAMENTO ESTÁTICO</w:t>
+                      </w:r>
+                    </w:p>
+                    <w:p>
+                      <w:pPr>
+                        <w:jc w:val="center"/>
+                      </w:pPr>
+                      <w:r>
+                        <w:rPr>
+                          <w:sz w:val="32"/>
+                          <w:szCs w:val="30"/>
+                        </w:rPr>
+                        <w:t>CONFIGURAÇÃO DE UMA ROTA ESTÁTICA FLUTUANTE</w:t>
+                      </w:r>
+                    </w:p>
+                    <w:p>
+                      <w:pPr>
+                        <w:ind w:left="0"/>
+                      </w:pPr>
+                    </w:p>
+                  </w:txbxContent>
+                </v:textbox>
+                <w10:wrap anchorx="page"/>
+              </v:shape>
+            </w:pict>
+          </mc:Fallback>
+        </mc:AlternateContent>
+      </w:r>
+      <w:r>
+        <w:rPr>
+          <w:b/>
+          <w:i/>
+          <w:noProof/>
+          <w:sz w:val="40"/>
+        </w:rPr>
+        <mc:AlternateContent>
+          <mc:Choice Requires="wps">
+            <w:drawing>
+              <wp:anchor distT="0" distB="0" distL="114300" distR="114300" simplePos="0" relativeHeight="251660288" behindDoc="0" locked="0" layoutInCell="1" allowOverlap="1" wp14:anchorId="1B02DECB" wp14:editId="5829C7C5">
+                <wp:simplePos x="0" y="0"/>
+                <wp:positionH relativeFrom="page">
+                  <wp:posOffset>3133725</wp:posOffset>
+                </wp:positionH>
+                <wp:positionV relativeFrom="paragraph">
+                  <wp:posOffset>-210185</wp:posOffset>
+                </wp:positionV>
+                <wp:extent cx="1257300" cy="952500"/>
+                <wp:effectExtent l="0" t="0" r="19050" b="19050"/>
+                <wp:wrapNone/>
+                <wp:docPr id="3" name="Caixa de texto 3"/>
+                <wp:cNvGraphicFramePr/>
+                <a:graphic xmlns:a="http://schemas.openxmlformats.org/drawingml/2006/main">
+                  <a:graphicData uri="http://schemas.microsoft.com/office/word/2010/wordprocessingShape">
+                    <wps:wsp>
+                      <wps:cNvSpPr txBox="1"/>
+                      <wps:spPr>
+                        <a:xfrm>
+                          <a:off x="0" y="0"/>
+                          <a:ext cx="1257300" cy="952500"/>
+                        </a:xfrm>
+                        <a:prstGeom prst="rect">
+                          <a:avLst/>
+                        </a:prstGeom>
+                        <a:solidFill>
+                          <a:schemeClr val="lt1"/>
+                        </a:solidFill>
+                        <a:ln w="6350">
+                          <a:solidFill>
+                            <a:schemeClr val="bg1"/>
+                          </a:solidFill>
+                        </a:ln>
+                        <a:effectLst/>
+                      </wps:spPr>
+                      <wps:style>
+                        <a:lnRef idx="0">
+                          <a:schemeClr val="accent1"/>
+                        </a:lnRef>
+                        <a:fillRef idx="0">
+                          <a:schemeClr val="accent1"/>
+                        </a:fillRef>
+                        <a:effectRef idx="0">
+                          <a:schemeClr val="accent1"/>
+                        </a:effectRef>
+                        <a:fontRef idx="minor">
+                          <a:schemeClr val="dk1"/>
+                        </a:fontRef>
+                      </wps:style>
+                      <wps:txbx>
+                        <w:txbxContent>
+                          <w:p>
+                            <w:pPr>
+                              <w:ind w:left="0"/>
+                              <w:jc w:val="center"/>
+                            </w:pPr>
+                            <w:r>
+                              <w:rPr>
+                                <w:noProof/>
+                              </w:rPr>
+                              <w:drawing>
+                                <wp:inline distT="0" distB="0" distL="0" distR="0" wp14:anchorId="3289F5EB" wp14:editId="71ABF852">
+                                  <wp:extent cx="1086474" cy="864817"/>
+                                  <wp:effectExtent l="0" t="0" r="0" b="0"/>
+                                  <wp:docPr id="10" name="Imagem 10"/>
+                                  <wp:cNvGraphicFramePr>
+                                    <a:graphicFrameLocks xmlns:a="http://schemas.openxmlformats.org/drawingml/2006/main" noChangeAspect="1"/>
+                                  </wp:cNvGraphicFramePr>
+                                  <a:graphic xmlns:a="http://schemas.openxmlformats.org/drawingml/2006/main">
+                                    <a:graphicData uri="http://schemas.openxmlformats.org/drawingml/2006/picture">
+                                      <pic:pic xmlns:pic="http://schemas.openxmlformats.org/drawingml/2006/picture">
+                                        <pic:nvPicPr>
+                                          <pic:cNvPr id="1" name="ITEL.png"/>
+                                          <pic:cNvPicPr/>
+                                        </pic:nvPicPr>
+                                        <pic:blipFill>
+                                          <a:blip r:embed="rId8" cstate="print">
+                                            <a:extLst>
+                                              <a:ext uri="{28A0092B-C50C-407E-A947-70E740481C1C}">
+                                                <a14:useLocalDpi xmlns:a14="http://schemas.microsoft.com/office/drawing/2010/main" val="0"/>
+                                              </a:ext>
+                                            </a:extLst>
+                                          </a:blip>
+                                          <a:stretch>
+                                            <a:fillRect/>
+                                          </a:stretch>
+                                        </pic:blipFill>
+                                        <pic:spPr>
+                                          <a:xfrm>
+                                            <a:off x="0" y="0"/>
+                                            <a:ext cx="1086474" cy="864817"/>
+                                          </a:xfrm>
+                                          <a:prstGeom prst="rect">
+                                            <a:avLst/>
+                                          </a:prstGeom>
+                                        </pic:spPr>
+                                      </pic:pic>
+                                    </a:graphicData>
+                                  </a:graphic>
+                                </wp:inline>
+                              </w:drawing>
+                            </w:r>
+                          </w:p>
+                        </w:txbxContent>
+                      </wps:txbx>
+                      <wps:bodyPr rot="0" spcFirstLastPara="0" vertOverflow="overflow" horzOverflow="overflow" vert="horz" wrap="square" lIns="91440" tIns="45720" rIns="91440" bIns="45720" numCol="1" spcCol="0" rtlCol="0" fromWordArt="0" anchor="t" anchorCtr="0" forceAA="0" compatLnSpc="1">
+                        <a:prstTxWarp prst="textNoShape">
+                          <a:avLst/>
+                        </a:prstTxWarp>
+                        <a:noAutofit/>
+                      </wps:bodyPr>
+                    </wps:wsp>
+                  </a:graphicData>
+                </a:graphic>
+                <wp14:sizeRelH relativeFrom="margin">
+                  <wp14:pctWidth>0</wp14:pctWidth>
+                </wp14:sizeRelH>
+                <wp14:sizeRelV relativeFrom="margin">
+                  <wp14:pctHeight>0</wp14:pctHeight>
+                </wp14:sizeRelV>
+              </wp:anchor>
+            </w:drawing>
+          </mc:Choice>
+          <mc:Fallback>
+            <w:pict>
+              <v:shape w14:anchorId="1B02DECB" id="Caixa de texto 3" o:spid="_x0000_s1027" type="#_x0000_t202" style="position:absolute;margin-left:246.75pt;margin-top:-16.55pt;width:99pt;height:75pt;z-index:251660288;visibility:visible;mso-wrap-style:square;mso-width-percent:0;mso-height-percent:0;mso-wrap-distance-left:9pt;mso-wrap-distance-top:0;mso-wrap-distance-right:9pt;mso-wrap-distance-bottom:0;mso-position-horizontal:absolute;mso-position-horizontal-relative:page;mso-position-vertical:absolute;mso-position-vertical-relative:text;mso-width-percent:0;mso-height-percent:0;mso-width-relative:margin;mso-height-relative:margin;v-text-anchor:top" o:gfxdata="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" fillcolor="white [3201]" strokecolor="white [3212]" strokeweight=".5pt">
+                <v:textbox>
+                  <w:txbxContent>
+                    <w:p>
+                      <w:pPr>
+                        <w:ind w:left="0"/>
+                        <w:jc w:val="center"/>
+                      </w:pPr>
+                      <w:r>
+                        <w:rPr>
+                          <w:noProof/>
+                        </w:rPr>
+                        <w:drawing>
+                          <wp:inline distT="0" distB="0" distL="0" distR="0" wp14:anchorId="3289F5EB" wp14:editId="71ABF852">
+                            <wp:extent cx="1086474" cy="864817"/>
+                            <wp:effectExtent l="0" t="0" r="0" b="0"/>
+                            <wp:docPr id="10" name="Imagem 10"/>
+                            <wp:cNvGraphicFramePr>
+                              <a:graphicFrameLocks xmlns:a="http://schemas.openxmlformats.org/drawingml/2006/main" noChangeAspect="1"/>
+                            </wp:cNvGraphicFramePr>
+                            <a:graphic xmlns:a="http://schemas.openxmlformats.org/drawingml/2006/main">
+                              <a:graphicData uri="http://schemas.openxmlformats.org/drawingml/2006/picture">
+                                <pic:pic xmlns:pic="http://schemas.openxmlformats.org/drawingml/2006/picture">
+                                  <pic:nvPicPr>
+                                    <pic:cNvPr id="1" name="ITEL.png"/>
+                                    <pic:cNvPicPr/>
+                                  </pic:nvPicPr>
+                                  <pic:blipFill>
+                                    <a:blip r:embed="rId8" cstate="print">
+                                      <a:extLst>
+                                        <a:ext uri="{28A0092B-C50C-407E-A947-70E740481C1C}">
+                                          <a14:useLocalDpi xmlns:a14="http://schemas.microsoft.com/office/drawing/2010/main" val="0"/>
+                                        </a:ext>
+                                      </a:extLst>
+                                    </a:blip>
+                                    <a:stretch>
+                                      <a:fillRect/>
+                                    </a:stretch>
+                                  </pic:blipFill>
+                                  <pic:spPr>
+                                    <a:xfrm>
+                                      <a:off x="0" y="0"/>
+                                      <a:ext cx="1086474" cy="864817"/>
+                                    </a:xfrm>
+                                    <a:prstGeom prst="rect">
+                                      <a:avLst/>
+                                    </a:prstGeom>
+                                  </pic:spPr>
+                                </pic:pic>
+                              </a:graphicData>
+                            </a:graphic>
+                          </wp:inline>
+                        </w:drawing>
+                      </w:r>
+                    </w:p>
+                  </w:txbxContent>
+                </v:textbox>
+                <w10:wrap anchorx="page"/>
+              </v:shape>
+            </w:pict>
+          </mc:Fallback>
+        </mc:AlternateContent>
+      </w:r>
+      <w:r>
+        <w:rPr>
+          <w:b/>
+          <w:i/>
+          <w:noProof/>
+          <w:sz w:val="40"/>
+        </w:rPr>
+        <mc:AlternateContent>
+          <mc:Choice Requires="wps">
+            <w:drawing>
+              <wp:anchor distT="0" distB="0" distL="114300" distR="114300" simplePos="0" relativeHeight="251661312" behindDoc="0" locked="0" layoutInCell="1" allowOverlap="1" wp14:anchorId="55E1A8FB" wp14:editId="4D1C8BE9">
+                <wp:simplePos x="0" y="0"/>
+                <wp:positionH relativeFrom="page">
+                  <wp:align>right</wp:align>
+                </wp:positionH>
+                <wp:positionV relativeFrom="paragraph">
+                  <wp:posOffset>808990</wp:posOffset>
+                </wp:positionV>
+                <wp:extent cx="7000875" cy="1104900"/>
+                <wp:effectExtent l="0" t="0" r="28575" b="19050"/>
+                <wp:wrapNone/>
+                <wp:docPr id="8" name="Caixa de texto 8"/>
+                <wp:cNvGraphicFramePr/>
+                <a:graphic xmlns:a="http://schemas.openxmlformats.org/drawingml/2006/main">
+                  <a:graphicData uri="http://schemas.microsoft.com/office/word/2010/wordprocessingShape">
+                    <wps:wsp>
+                      <wps:cNvSpPr txBox="1"/>
+                      <wps:spPr>
+                        <a:xfrm>
+                          <a:off x="0" y="0"/>
+                          <a:ext cx="7000875" cy="1104900"/>
+                        </a:xfrm>
+                        <a:prstGeom prst="rect">
+                          <a:avLst/>
+                        </a:prstGeom>
+                        <a:solidFill>
+                          <a:schemeClr val="lt1"/>
+                        </a:solidFill>
+                        <a:ln w="6350">
+                          <a:solidFill>
+                            <a:schemeClr val="bg1"/>
+                          </a:solidFill>
+                        </a:ln>
+                        <a:effectLst/>
+                      </wps:spPr>
+                      <wps:style>
+                        <a:lnRef idx="0">
+                          <a:schemeClr val="accent1"/>
+                        </a:lnRef>
+                        <a:fillRef idx="0">
+                          <a:schemeClr val="accent1"/>
+                        </a:fillRef>
+                        <a:effectRef idx="0">
+                          <a:schemeClr val="accent1"/>
+                        </a:effectRef>
+                        <a:fontRef idx="minor">
+                          <a:schemeClr val="dk1"/>
+                        </a:fontRef>
+                      </wps:style>
+                      <wps:txbx>
+                        <w:txbxContent>
+                          <w:p>
+                            <w:pPr>
+                              <w:spacing w:after="0" w:line="276" w:lineRule="auto"/>
+                              <w:jc w:val="center"/>
+                              <w:rPr>
+                                <w:b/>
+                              </w:rPr>
+                            </w:pPr>
+                            <w:r>
+                              <w:rPr>
+                                <w:b/>
+                              </w:rPr>
+                              <w:t xml:space="preserve">INSTITUTO DE TELECOMUNICAÇÕES </w:t>
+                            </w:r>
+                            <w:r>
+                              <w:rPr>
+                                <w:b/>
+                                <w:sz w:val="28"/>
+                              </w:rPr>
+                              <w:t xml:space="preserve">– </w:t>
+                            </w:r>
+                            <w:r>
+                              <w:rPr>
+                                <w:b/>
+                              </w:rPr>
+                              <w:t>ITEL</w:t>
+                            </w:r>
+                          </w:p>
+                          <w:p>
+                            <w:pPr>
+                              <w:spacing w:after="0" w:line="276" w:lineRule="auto"/>
+                              <w:jc w:val="center"/>
+                              <w:rPr>
+                                <w:b/>
+                              </w:rPr>
+                            </w:pPr>
+                            <w:r>
+                              <w:rPr>
+                                <w:b/>
+                              </w:rPr>
+                              <w:t xml:space="preserve">SISTEMA DE EXPLORAÇÃO E ARQUITETURA DO COMPUTADOR </w:t>
+                            </w:r>
+                            <w:r>
+                              <w:rPr>
+                                <w:b/>
+                                <w:sz w:val="28"/>
+                              </w:rPr>
+                              <w:t xml:space="preserve">– </w:t>
+                            </w:r>
+                            <w:r>
+                              <w:rPr>
+                                <w:b/>
+                              </w:rPr>
+                              <w:t>SEAC</w:t>
+                            </w:r>
+                          </w:p>
+                          <w:p>
+                            <w:pPr>
+                              <w:ind w:left="0"/>
+                            </w:pPr>
+                          </w:p>
+                        </w:txbxContent>
+                      </wps:txbx>
+                      <wps:bodyPr rot="0" spcFirstLastPara="0" vertOverflow="overflow" horzOverflow="overflow" vert="horz" wrap="square" lIns="91440" tIns="45720" rIns="91440" bIns="45720" numCol="1" spcCol="0" rtlCol="0" fromWordArt="0" anchor="t" anchorCtr="0" forceAA="0" compatLnSpc="1">
+                        <a:prstTxWarp prst="textNoShape">
+                          <a:avLst/>
+                        </a:prstTxWarp>
+                        <a:noAutofit/>
+                      </wps:bodyPr>
+                    </wps:wsp>
+                  </a:graphicData>
+                </a:graphic>
+                <wp14:sizeRelH relativeFrom="margin">
+                  <wp14:pctWidth>0</wp14:pctWidth>
+                </wp14:sizeRelH>
+              </wp:anchor>
+            </w:drawing>
+          </mc:Choice>
+          <mc:Fallback>
+            <w:pict>
+              <v:shape w14:anchorId="55E1A8FB" id="Caixa de texto 8" o:spid="_x0000_s1028" type="#_x0000_t202" style="position:absolute;margin-left:500.05pt;margin-top:63.7pt;width:551.25pt;height:87pt;z-index:251661312;visibility:visible;mso-wrap-style:square;mso-width-percent:0;mso-wrap-distance-left:9pt;mso-wrap-distance-top:0;mso-wrap-distance-right:9pt;mso-wrap-distance-bottom:0;mso-position-horizontal:right;mso-position-horizontal-relative:page;mso-position-vertical:absolute;mso-position-vertical-relative:text;mso-width-percent:0;mso-width-relative:margin;v-text-anchor:top" o:gfxdata="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" fillcolor="white [3201]" strokecolor="white [3212]" strokeweight=".5pt">
+                <v:textbox>
+                  <w:txbxContent>
+                    <w:p>
+                      <w:pPr>
+                        <w:spacing w:after="0" w:line="276" w:lineRule="auto"/>
+                        <w:jc w:val="center"/>
+                        <w:rPr>
+                          <w:b/>
+                        </w:rPr>
+                      </w:pPr>
+                      <w:r>
+                        <w:rPr>
+                          <w:b/>
+                        </w:rPr>
+                        <w:t xml:space="preserve">INSTITUTO DE TELECOMUNICAÇÕES </w:t>
+                      </w:r>
+                      <w:r>
+                        <w:rPr>
+                          <w:b/>
+                          <w:sz w:val="28"/>
+                        </w:rPr>
+                        <w:t xml:space="preserve">– </w:t>
+                      </w:r>
+                      <w:r>
+                        <w:rPr>
+                          <w:b/>
+                        </w:rPr>
+                        <w:t>ITEL</w:t>
+                      </w:r>
+                    </w:p>
+                    <w:p>
+                      <w:pPr>
+                        <w:spacing w:after="0" w:line="276" w:lineRule="auto"/>
+                        <w:jc w:val="center"/>
+                        <w:rPr>
+                          <w:b/>
+                        </w:rPr>
+                      </w:pPr>
+                      <w:r>
+                        <w:rPr>
+                          <w:b/>
+                        </w:rPr>
+                        <w:t xml:space="preserve">SISTEMA DE EXPLORAÇÃO E ARQUITETURA DO COMPUTADOR </w:t>
+                      </w:r>
+                      <w:r>
+                        <w:rPr>
+                          <w:b/>
+                          <w:sz w:val="28"/>
+                        </w:rPr>
+                        <w:t xml:space="preserve">– </w:t>
+                      </w:r>
+                      <w:r>
+                        <w:rPr>
+                          <w:b/>
+                        </w:rPr>
+                        <w:t>SEAC</w:t>
+                      </w:r>
+                    </w:p>
+                    <w:p>
+                      <w:pPr>
+                        <w:ind w:left="0"/>
+                      </w:pPr>
+                    </w:p>
+                  </w:txbxContent>
+                </v:textbox>
+                <w10:wrap anchorx="page"/>
+              </v:shape>
+            </w:pict>
+          </mc:Fallback>
+        </mc:AlternateContent>
+      </w:r>
+      <w:r>
+        <w:rPr>
+          <w:noProof/>
+        </w:rPr>
+        <mc:AlternateContent>
+          <mc:Choice Requires="wps">
+            <w:drawing>
+              <wp:anchor distT="0" distB="0" distL="114300" distR="114300" simplePos="0" relativeHeight="251664384" behindDoc="0" locked="0" layoutInCell="1" allowOverlap="1" wp14:anchorId="3F21A0E1" wp14:editId="0825B7E0">
+                <wp:simplePos x="0" y="0"/>
+                <wp:positionH relativeFrom="page">
+                  <wp:posOffset>2084705</wp:posOffset>
+                </wp:positionH>
+                <wp:positionV relativeFrom="paragraph">
+                  <wp:posOffset>9582150</wp:posOffset>
+                </wp:positionV>
+                <wp:extent cx="3371850" cy="283028"/>
+                <wp:effectExtent l="0" t="0" r="19050" b="22225"/>
+                <wp:wrapNone/>
+                <wp:docPr id="4" name="Caixa de texto 4"/>
+                <wp:cNvGraphicFramePr/>
+                <a:graphic xmlns:a="http://schemas.openxmlformats.org/drawingml/2006/main">
+                  <a:graphicData uri="http://schemas.microsoft.com/office/word/2010/wordprocessingShape">
+                    <wps:wsp>
+                      <wps:cNvSpPr txBox="1"/>
+                      <wps:spPr>
+                        <a:xfrm>
+                          <a:off x="0" y="0"/>
+                          <a:ext cx="3371850" cy="283028"/>
+                        </a:xfrm>
+                        <a:prstGeom prst="rect">
+                          <a:avLst/>
+                        </a:prstGeom>
+                        <a:solidFill>
+                          <a:schemeClr val="lt1"/>
+                        </a:solidFill>
+                        <a:ln w="6350">
+                          <a:solidFill>
+                            <a:schemeClr val="bg1"/>
+                          </a:solidFill>
+                        </a:ln>
+                        <a:effectLst/>
+                      </wps:spPr>
+                      <wps:style>
+                        <a:lnRef idx="0">
+                          <a:schemeClr val="accent1"/>
+                        </a:lnRef>
+                        <a:fillRef idx="0">
+                          <a:schemeClr val="accent1"/>
+                        </a:fillRef>
+                        <a:effectRef idx="0">
+                          <a:schemeClr val="accent1"/>
+                        </a:effectRef>
+                        <a:fontRef idx="minor">
+                          <a:schemeClr val="dk1"/>
+                        </a:fontRef>
+                      </wps:style>
+                      <wps:txbx>
+                        <w:txbxContent>
+                          <w:p>
+                            <w:pPr>
+                              <w:pStyle w:val="Rodap"/>
+                              <w:jc w:val="center"/>
+                              <w:rPr>
+                                <w:rFonts w:ascii="Times New Roman" w:hAnsi="Times New Roman" w:cs="Times New Roman"/>
+                                <w:sz w:val="26"/>
+                                <w:szCs w:val="26"/>
+                              </w:rPr>
+                            </w:pPr>
+                            <w:r>
+                              <w:rPr>
+                                <w:rFonts w:ascii="Times New Roman" w:hAnsi="Times New Roman" w:cs="Times New Roman"/>
+                                <w:sz w:val="26"/>
+                                <w:szCs w:val="26"/>
+                              </w:rPr>
+                              <w:t>Luanda, Abril de 2026</w:t>
+                            </w:r>
+                          </w:p>
+                        </w:txbxContent>
+                      </wps:txbx>
+                      <wps:bodyPr rot="0" spcFirstLastPara="0" vertOverflow="overflow" horzOverflow="overflow" vert="horz" wrap="square" lIns="91440" tIns="45720" rIns="91440" bIns="45720" numCol="1" spcCol="0" rtlCol="0" fromWordArt="0" anchor="t" anchorCtr="0" forceAA="0" compatLnSpc="1">
+                        <a:prstTxWarp prst="textNoShape">
+                          <a:avLst/>
+                        </a:prstTxWarp>
+                        <a:noAutofit/>
+                      </wps:bodyPr>
+                    </wps:wsp>
+                  </a:graphicData>
+                </a:graphic>
+                <wp14:sizeRelV relativeFrom="margin">
+                  <wp14:pctHeight>0</wp14:pctHeight>
+                </wp14:sizeRelV>
+              </wp:anchor>
+            </w:drawing>
+          </mc:Choice>
+          <mc:Fallback>
+            <w:pict>
+              <v:shape w14:anchorId="3F21A0E1" id="Caixa de texto 4" o:spid="_x0000_s1029" type="#_x0000_t202" style="position:absolute;margin-left:164.15pt;margin-top:754.5pt;width:265.5pt;height:22.3pt;z-index:251664384;visibility:visible;mso-wrap-style:square;mso-height-percent:0;mso-wrap-distance-left:9pt;mso-wrap-distance-top:0;mso-wrap-distance-right:9pt;mso-wrap-distance-bottom:0;mso-position-horizontal:absolute;mso-position-horizontal-relative:page;mso-position-vertical:absolute;mso-position-vertical-relative:text;mso-height-percent:0;mso-height-relative:margin;v-text-anchor:top" o:gfxdata="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" fillcolor="white [3201]" strokecolor="white [3212]" strokeweight=".5pt">
+                <v:textbox>
+                  <w:txbxContent>
+                    <w:p>
+                      <w:pPr>
+                        <w:pStyle w:val="Rodap"/>
+                        <w:jc w:val="center"/>
+                        <w:rPr>
+                          <w:rFonts w:ascii="Times New Roman" w:hAnsi="Times New Roman" w:cs="Times New Roman"/>
+                          <w:sz w:val="26"/>
+                          <w:szCs w:val="26"/>
+                        </w:rPr>
+                      </w:pPr>
+                      <w:r>
+                        <w:rPr>
+                          <w:rFonts w:ascii="Times New Roman" w:hAnsi="Times New Roman" w:cs="Times New Roman"/>
+                          <w:sz w:val="26"/>
+                          <w:szCs w:val="26"/>
+                        </w:rPr>
+                        <w:t>Luanda, Abril de 2026</w:t>
+                      </w:r>
+                    </w:p>
+                  </w:txbxContent>
+                </v:textbox>
+                <w10:wrap anchorx="page"/>
+              </v:shape>
+            </w:pict>
+          </mc:Fallback>
+        </mc:AlternateContent>
+      </w:r>
+      <w:r>
+        <w:rPr>
+          <w:b/>
+          <w:i/>
+          <w:sz w:val="40"/>
+        </w:rPr>
+        <w:br w:type="page"/>
+      </w:r>
+      <w:bookmarkStart w:id="0" w:name="_GoBack"/>
+      <w:bookmarkEnd w:id="0"/>
+    </w:p>
     <w:p>
       <w:pPr>
         <w:ind w:left="0" w:firstLine="0"/>
@@ -11,14 +735,13 @@
           <w:sz w:val="40"/>
         </w:rPr>
       </w:pPr>
-      <w:bookmarkStart w:id="0" w:name="_GoBack"/>
-      <w:bookmarkEnd w:id="0"/>
       <w:r>
         <w:rPr>
           <w:b/>
           <w:i/>
           <w:sz w:val="40"/>
         </w:rPr>
+        <w:lastRenderedPageBreak/>
         <w:t>ÍNDICE</w:t>
       </w:r>
     </w:p>
@@ -34,21 +757,20 @@
       <w:r>
         <w:rPr>
           <w:noProof/>
-          <w:lang w:val="en-US" w:eastAsia="en-US"/>
         </w:rPr>
         <mc:AlternateContent>
           <mc:Choice Requires="wps">
             <w:drawing>
-              <wp:anchor distT="0" distB="0" distL="114300" distR="114300" simplePos="0" relativeHeight="251659264" behindDoc="0" locked="0" layoutInCell="1" allowOverlap="1" wp14:anchorId="4C3901EF" wp14:editId="420C0A5C">
+              <wp:anchor distT="0" distB="0" distL="114300" distR="114300" simplePos="0" relativeHeight="251659264" behindDoc="0" locked="0" layoutInCell="1" allowOverlap="1" wp14:anchorId="6FDE9053" wp14:editId="4853ABC0">
                 <wp:simplePos x="0" y="0"/>
-                <wp:positionH relativeFrom="column">
-                  <wp:posOffset>-519158</wp:posOffset>
+                <wp:positionH relativeFrom="margin">
+                  <wp:align>left</wp:align>
                 </wp:positionH>
                 <wp:positionV relativeFrom="paragraph">
                   <wp:posOffset>201023</wp:posOffset>
                 </wp:positionV>
-                <wp:extent cx="6716486" cy="8360228"/>
-                <wp:effectExtent l="0" t="0" r="27305" b="22225"/>
+                <wp:extent cx="6193881" cy="6890657"/>
+                <wp:effectExtent l="0" t="0" r="16510" b="24765"/>
                 <wp:wrapNone/>
                 <wp:docPr id="2" name="Caixa de Texto 2"/>
                 <wp:cNvGraphicFramePr/>
@@ -59,7 +781,7 @@
                       <wps:spPr>
                         <a:xfrm>
                           <a:off x="0" y="0"/>
-                          <a:ext cx="6716486" cy="8360228"/>
+                          <a:ext cx="6193881" cy="6890657"/>
                         </a:xfrm>
                         <a:prstGeom prst="rect">
                           <a:avLst/>
@@ -81,6 +803,8 @@
                               <w:tabs>
                                 <w:tab w:val="right" w:leader="hyphen" w:pos="10722"/>
                               </w:tabs>
+                              <w:spacing w:after="0" w:line="360" w:lineRule="auto"/>
+                              <w:ind w:left="0" w:firstLine="0"/>
                               <w:rPr>
                                 <w:rFonts w:asciiTheme="minorHAnsi" w:eastAsiaTheme="minorEastAsia" w:hAnsiTheme="minorHAnsi" w:cstheme="minorBidi"/>
                                 <w:noProof/>
@@ -145,7 +869,7 @@
                                   <w:noProof/>
                                   <w:webHidden/>
                                 </w:rPr>
-                                <w:t>3</w:t>
+                                <w:t>4</w:t>
                               </w:r>
                               <w:r>
                                 <w:rPr>
@@ -162,6 +886,7 @@
                               <w:tabs>
                                 <w:tab w:val="right" w:leader="hyphen" w:pos="10722"/>
                               </w:tabs>
+                              <w:ind w:left="0" w:firstLine="0"/>
                               <w:rPr>
                                 <w:rFonts w:asciiTheme="minorHAnsi" w:eastAsiaTheme="minorEastAsia" w:hAnsiTheme="minorHAnsi" w:cstheme="minorBidi"/>
                                 <w:noProof/>
@@ -217,7 +942,7 @@
                                   <w:noProof/>
                                   <w:webHidden/>
                                 </w:rPr>
-                                <w:t>4</w:t>
+                                <w:t>5</w:t>
                               </w:r>
                               <w:r>
                                 <w:rPr>
@@ -234,6 +959,7 @@
                               <w:tabs>
                                 <w:tab w:val="right" w:leader="hyphen" w:pos="10722"/>
                               </w:tabs>
+                              <w:ind w:left="0" w:firstLine="0"/>
                               <w:rPr>
                                 <w:rFonts w:asciiTheme="minorHAnsi" w:eastAsiaTheme="minorEastAsia" w:hAnsiTheme="minorHAnsi" w:cstheme="minorBidi"/>
                                 <w:noProof/>
@@ -289,7 +1015,7 @@
                                   <w:noProof/>
                                   <w:webHidden/>
                                 </w:rPr>
-                                <w:t>4</w:t>
+                                <w:t>5</w:t>
                               </w:r>
                               <w:r>
                                 <w:rPr>
@@ -306,6 +1032,7 @@
                               <w:tabs>
                                 <w:tab w:val="right" w:leader="hyphen" w:pos="10722"/>
                               </w:tabs>
+                              <w:ind w:left="0" w:firstLine="0"/>
                               <w:rPr>
                                 <w:rFonts w:asciiTheme="minorHAnsi" w:eastAsiaTheme="minorEastAsia" w:hAnsiTheme="minorHAnsi" w:cstheme="minorBidi"/>
                                 <w:noProof/>
@@ -314,6 +1041,9 @@
                                 <w:lang w:val="en-US" w:eastAsia="en-US"/>
                               </w:rPr>
                             </w:pPr>
+                            <w:r>
+                              <w:t xml:space="preserve">         </w:t>
+                            </w:r>
                             <w:hyperlink w:anchor="_Toc227927092" w:history="1">
                               <w:r>
                                 <w:rPr>
@@ -361,7 +1091,7 @@
                                   <w:noProof/>
                                   <w:webHidden/>
                                 </w:rPr>
-                                <w:t>4</w:t>
+                                <w:t>5</w:t>
                               </w:r>
                               <w:r>
                                 <w:rPr>
@@ -378,6 +1108,7 @@
                               <w:tabs>
                                 <w:tab w:val="right" w:leader="hyphen" w:pos="10722"/>
                               </w:tabs>
+                              <w:ind w:left="0" w:firstLine="0"/>
                               <w:rPr>
                                 <w:rFonts w:asciiTheme="minorHAnsi" w:eastAsiaTheme="minorEastAsia" w:hAnsiTheme="minorHAnsi" w:cstheme="minorBidi"/>
                                 <w:noProof/>
@@ -386,6 +1117,9 @@
                                 <w:lang w:val="en-US" w:eastAsia="en-US"/>
                               </w:rPr>
                             </w:pPr>
+                            <w:r>
+                              <w:t xml:space="preserve">         </w:t>
+                            </w:r>
                             <w:hyperlink w:anchor="_Toc227927093" w:history="1">
                               <w:r>
                                 <w:rPr>
@@ -433,7 +1167,7 @@
                                   <w:noProof/>
                                   <w:webHidden/>
                                 </w:rPr>
-                                <w:t>5</w:t>
+                                <w:t>6</w:t>
                               </w:r>
                               <w:r>
                                 <w:rPr>
@@ -450,6 +1184,7 @@
                               <w:tabs>
                                 <w:tab w:val="right" w:leader="hyphen" w:pos="10722"/>
                               </w:tabs>
+                              <w:ind w:left="0" w:firstLine="0"/>
                               <w:jc w:val="both"/>
                               <w:rPr>
                                 <w:rFonts w:asciiTheme="minorHAnsi" w:eastAsiaTheme="minorEastAsia" w:hAnsiTheme="minorHAnsi" w:cstheme="minorBidi"/>
@@ -459,6 +1194,9 @@
                                 <w:lang w:val="en-US" w:eastAsia="en-US"/>
                               </w:rPr>
                             </w:pPr>
+                            <w:r>
+                              <w:t xml:space="preserve">              </w:t>
+                            </w:r>
                             <w:hyperlink w:anchor="_Toc227927094" w:history="1">
                               <w:r>
                                 <w:rPr>
@@ -506,7 +1244,7 @@
                                   <w:noProof/>
                                   <w:webHidden/>
                                 </w:rPr>
-                                <w:t>5</w:t>
+                                <w:t>6</w:t>
                               </w:r>
                               <w:r>
                                 <w:rPr>
@@ -523,6 +1261,7 @@
                               <w:tabs>
                                 <w:tab w:val="right" w:leader="hyphen" w:pos="10722"/>
                               </w:tabs>
+                              <w:ind w:left="0" w:firstLine="0"/>
                               <w:jc w:val="both"/>
                               <w:rPr>
                                 <w:rFonts w:asciiTheme="minorHAnsi" w:eastAsiaTheme="minorEastAsia" w:hAnsiTheme="minorHAnsi" w:cstheme="minorBidi"/>
@@ -532,6 +1271,9 @@
                                 <w:lang w:val="en-US" w:eastAsia="en-US"/>
                               </w:rPr>
                             </w:pPr>
+                            <w:r>
+                              <w:t xml:space="preserve">              </w:t>
+                            </w:r>
                             <w:hyperlink w:anchor="_Toc227927095" w:history="1">
                               <w:r>
                                 <w:rPr>
@@ -579,7 +1321,7 @@
                                   <w:noProof/>
                                   <w:webHidden/>
                                 </w:rPr>
-                                <w:t>5</w:t>
+                                <w:t>6</w:t>
                               </w:r>
                               <w:r>
                                 <w:rPr>
@@ -596,6 +1338,7 @@
                               <w:tabs>
                                 <w:tab w:val="right" w:leader="hyphen" w:pos="10722"/>
                               </w:tabs>
+                              <w:ind w:left="0" w:firstLine="0"/>
                               <w:jc w:val="both"/>
                               <w:rPr>
                                 <w:rFonts w:asciiTheme="minorHAnsi" w:eastAsiaTheme="minorEastAsia" w:hAnsiTheme="minorHAnsi" w:cstheme="minorBidi"/>
@@ -605,6 +1348,9 @@
                                 <w:lang w:val="en-US" w:eastAsia="en-US"/>
                               </w:rPr>
                             </w:pPr>
+                            <w:r>
+                              <w:t xml:space="preserve">              </w:t>
+                            </w:r>
                             <w:hyperlink w:anchor="_Toc227927096" w:history="1">
                               <w:r>
                                 <w:rPr>
@@ -652,7 +1398,7 @@
                                   <w:noProof/>
                                   <w:webHidden/>
                                 </w:rPr>
-                                <w:t>5</w:t>
+                                <w:t>6</w:t>
                               </w:r>
                               <w:r>
                                 <w:rPr>
@@ -669,6 +1415,7 @@
                               <w:tabs>
                                 <w:tab w:val="right" w:leader="hyphen" w:pos="10722"/>
                               </w:tabs>
+                              <w:ind w:left="0" w:firstLine="0"/>
                               <w:jc w:val="both"/>
                               <w:rPr>
                                 <w:rFonts w:asciiTheme="minorHAnsi" w:eastAsiaTheme="minorEastAsia" w:hAnsiTheme="minorHAnsi" w:cstheme="minorBidi"/>
@@ -678,6 +1425,9 @@
                                 <w:lang w:val="en-US" w:eastAsia="en-US"/>
                               </w:rPr>
                             </w:pPr>
+                            <w:r>
+                              <w:t xml:space="preserve">              </w:t>
+                            </w:r>
                             <w:hyperlink w:anchor="_Toc227927097" w:history="1">
                               <w:r>
                                 <w:rPr>
@@ -725,7 +1475,7 @@
                                   <w:noProof/>
                                   <w:webHidden/>
                                 </w:rPr>
-                                <w:t>5</w:t>
+                                <w:t>6</w:t>
                               </w:r>
                               <w:r>
                                 <w:rPr>
@@ -742,6 +1492,7 @@
                               <w:tabs>
                                 <w:tab w:val="right" w:leader="hyphen" w:pos="10722"/>
                               </w:tabs>
+                              <w:ind w:left="0" w:firstLine="0"/>
                               <w:rPr>
                                 <w:rFonts w:asciiTheme="minorHAnsi" w:eastAsiaTheme="minorEastAsia" w:hAnsiTheme="minorHAnsi" w:cstheme="minorBidi"/>
                                 <w:noProof/>
@@ -797,7 +1548,7 @@
                                   <w:noProof/>
                                   <w:webHidden/>
                                 </w:rPr>
-                                <w:t>6</w:t>
+                                <w:t>7</w:t>
                               </w:r>
                               <w:r>
                                 <w:rPr>
@@ -814,6 +1565,7 @@
                               <w:tabs>
                                 <w:tab w:val="right" w:leader="hyphen" w:pos="10722"/>
                               </w:tabs>
+                              <w:ind w:left="0" w:firstLine="0"/>
                               <w:rPr>
                                 <w:rFonts w:asciiTheme="minorHAnsi" w:eastAsiaTheme="minorEastAsia" w:hAnsiTheme="minorHAnsi" w:cstheme="minorBidi"/>
                                 <w:noProof/>
@@ -822,6 +1574,9 @@
                                 <w:lang w:val="en-US" w:eastAsia="en-US"/>
                               </w:rPr>
                             </w:pPr>
+                            <w:r>
+                              <w:t xml:space="preserve">         </w:t>
+                            </w:r>
                             <w:hyperlink w:anchor="_Toc227927099" w:history="1">
                               <w:r>
                                 <w:rPr>
@@ -869,7 +1624,7 @@
                                   <w:noProof/>
                                   <w:webHidden/>
                                 </w:rPr>
-                                <w:t>7</w:t>
+                                <w:t>8</w:t>
                               </w:r>
                               <w:r>
                                 <w:rPr>
@@ -886,6 +1641,7 @@
                               <w:tabs>
                                 <w:tab w:val="right" w:leader="hyphen" w:pos="10722"/>
                               </w:tabs>
+                              <w:ind w:left="0" w:firstLine="0"/>
                               <w:rPr>
                                 <w:rFonts w:asciiTheme="minorHAnsi" w:eastAsiaTheme="minorEastAsia" w:hAnsiTheme="minorHAnsi" w:cstheme="minorBidi"/>
                                 <w:noProof/>
@@ -941,7 +1697,7 @@
                                   <w:noProof/>
                                   <w:webHidden/>
                                 </w:rPr>
-                                <w:t>7</w:t>
+                                <w:t>8</w:t>
                               </w:r>
                               <w:r>
                                 <w:rPr>
@@ -958,6 +1714,7 @@
                               <w:tabs>
                                 <w:tab w:val="right" w:leader="hyphen" w:pos="10722"/>
                               </w:tabs>
+                              <w:ind w:left="0" w:firstLine="0"/>
                               <w:rPr>
                                 <w:rFonts w:asciiTheme="minorHAnsi" w:eastAsiaTheme="minorEastAsia" w:hAnsiTheme="minorHAnsi" w:cstheme="minorBidi"/>
                                 <w:noProof/>
@@ -1013,7 +1770,7 @@
                                   <w:noProof/>
                                   <w:webHidden/>
                                 </w:rPr>
-                                <w:t>8</w:t>
+                                <w:t>9</w:t>
                               </w:r>
                               <w:r>
                                 <w:rPr>
@@ -1030,6 +1787,7 @@
                               <w:tabs>
                                 <w:tab w:val="right" w:leader="hyphen" w:pos="10722"/>
                               </w:tabs>
+                              <w:ind w:left="0" w:firstLine="0"/>
                               <w:rPr>
                                 <w:rFonts w:asciiTheme="minorHAnsi" w:eastAsiaTheme="minorEastAsia" w:hAnsiTheme="minorHAnsi" w:cstheme="minorBidi"/>
                                 <w:noProof/>
@@ -1038,6 +1796,9 @@
                                 <w:lang w:val="en-US" w:eastAsia="en-US"/>
                               </w:rPr>
                             </w:pPr>
+                            <w:r>
+                              <w:t xml:space="preserve">           </w:t>
+                            </w:r>
                             <w:hyperlink w:anchor="_Toc227927102" w:history="1">
                               <w:r>
                                 <w:rPr>
@@ -1085,7 +1846,7 @@
                                   <w:noProof/>
                                   <w:webHidden/>
                                 </w:rPr>
-                                <w:t>8</w:t>
+                                <w:t>9</w:t>
                               </w:r>
                               <w:r>
                                 <w:rPr>
@@ -1102,6 +1863,7 @@
                               <w:tabs>
                                 <w:tab w:val="right" w:leader="hyphen" w:pos="10722"/>
                               </w:tabs>
+                              <w:ind w:left="0" w:firstLine="0"/>
                               <w:rPr>
                                 <w:rFonts w:asciiTheme="minorHAnsi" w:eastAsiaTheme="minorEastAsia" w:hAnsiTheme="minorHAnsi" w:cstheme="minorBidi"/>
                                 <w:noProof/>
@@ -1157,7 +1919,7 @@
                                   <w:noProof/>
                                   <w:webHidden/>
                                 </w:rPr>
-                                <w:t>8</w:t>
+                                <w:t>9</w:t>
                               </w:r>
                               <w:r>
                                 <w:rPr>
@@ -1174,6 +1936,7 @@
                               <w:tabs>
                                 <w:tab w:val="right" w:leader="hyphen" w:pos="10722"/>
                               </w:tabs>
+                              <w:ind w:left="0" w:firstLine="0"/>
                               <w:rPr>
                                 <w:rFonts w:asciiTheme="minorHAnsi" w:eastAsiaTheme="minorEastAsia" w:hAnsiTheme="minorHAnsi" w:cstheme="minorBidi"/>
                                 <w:noProof/>
@@ -1229,7 +1992,7 @@
                                   <w:noProof/>
                                   <w:webHidden/>
                                 </w:rPr>
-                                <w:t>9</w:t>
+                                <w:t>10</w:t>
                               </w:r>
                               <w:r>
                                 <w:rPr>
@@ -1270,11 +2033,7 @@
           </mc:Choice>
           <mc:Fallback>
             <w:pict>
-              <v:shapetype w14:anchorId="4C3901EF" id="_x0000_t202" coordsize="21600,21600" o:spt="202" path="m,l,21600r21600,l21600,xe">
-                <v:stroke joinstyle="miter"/>
-                <v:path gradientshapeok="t" o:connecttype="rect"/>
-              </v:shapetype>
-              <v:shape id="Caixa de Texto 2" o:spid="_x0000_s1026" type="#_x0000_t202" style="position:absolute;left:0;text-align:left;margin-left:-40.9pt;margin-top:15.85pt;width:528.85pt;height:658.3pt;z-index:251659264;visibility:visible;mso-wrap-style:square;mso-width-percent:0;mso-height-percent:0;mso-wrap-distance-left:9pt;mso-wrap-distance-top:0;mso-wrap-distance-right:9pt;mso-wrap-distance-bottom:0;mso-position-horizontal:absolute;mso-position-horizontal-relative:text;mso-position-vertical:absolute;mso-position-vertical-relative:text;mso-width-percent:0;mso-height-percent:0;mso-width-relative:margin;mso-height-relative:margin;v-text-anchor:top" o:gfxdata="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" fillcolor="white [3201]" strokecolor="white [3212]" strokeweight=".5pt">
+              <v:shape w14:anchorId="6FDE9053" id="Caixa de Texto 2" o:spid="_x0000_s1030" type="#_x0000_t202" style="position:absolute;left:0;text-align:left;margin-left:0;margin-top:15.85pt;width:487.7pt;height:542.55pt;z-index:251659264;visibility:visible;mso-wrap-style:square;mso-width-percent:0;mso-height-percent:0;mso-wrap-distance-left:9pt;mso-wrap-distance-top:0;mso-wrap-distance-right:9pt;mso-wrap-distance-bottom:0;mso-position-horizontal:left;mso-position-horizontal-relative:margin;mso-position-vertical:absolute;mso-position-vertical-relative:text;mso-width-percent:0;mso-height-percent:0;mso-width-relative:margin;mso-height-relative:margin;v-text-anchor:top" o:gfxdata="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" fillcolor="white [3201]" strokecolor="white [3212]" strokeweight=".5pt">
                 <v:textbox>
                   <w:txbxContent>
                     <w:p>
@@ -1283,6 +2042,8 @@
                         <w:tabs>
                           <w:tab w:val="right" w:leader="hyphen" w:pos="10722"/>
                         </w:tabs>
+                        <w:spacing w:after="0" w:line="360" w:lineRule="auto"/>
+                        <w:ind w:left="0" w:firstLine="0"/>
                         <w:rPr>
                           <w:rFonts w:asciiTheme="minorHAnsi" w:eastAsiaTheme="minorEastAsia" w:hAnsiTheme="minorHAnsi" w:cstheme="minorBidi"/>
                           <w:noProof/>
@@ -1347,7 +2108,7 @@
                             <w:noProof/>
                             <w:webHidden/>
                           </w:rPr>
-                          <w:t>3</w:t>
+                          <w:t>4</w:t>
                         </w:r>
                         <w:r>
                           <w:rPr>
@@ -1364,6 +2125,7 @@
                         <w:tabs>
                           <w:tab w:val="right" w:leader="hyphen" w:pos="10722"/>
                         </w:tabs>
+                        <w:ind w:left="0" w:firstLine="0"/>
                         <w:rPr>
                           <w:rFonts w:asciiTheme="minorHAnsi" w:eastAsiaTheme="minorEastAsia" w:hAnsiTheme="minorHAnsi" w:cstheme="minorBidi"/>
                           <w:noProof/>
@@ -1419,7 +2181,7 @@
                             <w:noProof/>
                             <w:webHidden/>
                           </w:rPr>
-                          <w:t>4</w:t>
+                          <w:t>5</w:t>
                         </w:r>
                         <w:r>
                           <w:rPr>
@@ -1436,6 +2198,7 @@
                         <w:tabs>
                           <w:tab w:val="right" w:leader="hyphen" w:pos="10722"/>
                         </w:tabs>
+                        <w:ind w:left="0" w:firstLine="0"/>
                         <w:rPr>
                           <w:rFonts w:asciiTheme="minorHAnsi" w:eastAsiaTheme="minorEastAsia" w:hAnsiTheme="minorHAnsi" w:cstheme="minorBidi"/>
                           <w:noProof/>
@@ -1491,7 +2254,7 @@
                             <w:noProof/>
                             <w:webHidden/>
                           </w:rPr>
-                          <w:t>4</w:t>
+                          <w:t>5</w:t>
                         </w:r>
                         <w:r>
                           <w:rPr>
@@ -1508,6 +2271,7 @@
                         <w:tabs>
                           <w:tab w:val="right" w:leader="hyphen" w:pos="10722"/>
                         </w:tabs>
+                        <w:ind w:left="0" w:firstLine="0"/>
                         <w:rPr>
                           <w:rFonts w:asciiTheme="minorHAnsi" w:eastAsiaTheme="minorEastAsia" w:hAnsiTheme="minorHAnsi" w:cstheme="minorBidi"/>
                           <w:noProof/>
@@ -1516,6 +2280,9 @@
                           <w:lang w:val="en-US" w:eastAsia="en-US"/>
                         </w:rPr>
                       </w:pPr>
+                      <w:r>
+                        <w:t xml:space="preserve">         </w:t>
+                      </w:r>
                       <w:hyperlink w:anchor="_Toc227927092" w:history="1">
                         <w:r>
                           <w:rPr>
@@ -1563,7 +2330,7 @@
                             <w:noProof/>
                             <w:webHidden/>
                           </w:rPr>
-                          <w:t>4</w:t>
+                          <w:t>5</w:t>
                         </w:r>
                         <w:r>
                           <w:rPr>
@@ -1580,6 +2347,7 @@
                         <w:tabs>
                           <w:tab w:val="right" w:leader="hyphen" w:pos="10722"/>
                         </w:tabs>
+                        <w:ind w:left="0" w:firstLine="0"/>
                         <w:rPr>
                           <w:rFonts w:asciiTheme="minorHAnsi" w:eastAsiaTheme="minorEastAsia" w:hAnsiTheme="minorHAnsi" w:cstheme="minorBidi"/>
                           <w:noProof/>
@@ -1588,6 +2356,9 @@
                           <w:lang w:val="en-US" w:eastAsia="en-US"/>
                         </w:rPr>
                       </w:pPr>
+                      <w:r>
+                        <w:t xml:space="preserve">         </w:t>
+                      </w:r>
                       <w:hyperlink w:anchor="_Toc227927093" w:history="1">
                         <w:r>
                           <w:rPr>
@@ -1635,7 +2406,7 @@
                             <w:noProof/>
                             <w:webHidden/>
                           </w:rPr>
-                          <w:t>5</w:t>
+                          <w:t>6</w:t>
                         </w:r>
                         <w:r>
                           <w:rPr>
@@ -1652,6 +2423,7 @@
                         <w:tabs>
                           <w:tab w:val="right" w:leader="hyphen" w:pos="10722"/>
                         </w:tabs>
+                        <w:ind w:left="0" w:firstLine="0"/>
                         <w:jc w:val="both"/>
                         <w:rPr>
                           <w:rFonts w:asciiTheme="minorHAnsi" w:eastAsiaTheme="minorEastAsia" w:hAnsiTheme="minorHAnsi" w:cstheme="minorBidi"/>
@@ -1661,6 +2433,9 @@
                           <w:lang w:val="en-US" w:eastAsia="en-US"/>
                         </w:rPr>
                       </w:pPr>
+                      <w:r>
+                        <w:t xml:space="preserve">              </w:t>
+                      </w:r>
                       <w:hyperlink w:anchor="_Toc227927094" w:history="1">
                         <w:r>
                           <w:rPr>
@@ -1708,7 +2483,7 @@
                             <w:noProof/>
                             <w:webHidden/>
                           </w:rPr>
-                          <w:t>5</w:t>
+                          <w:t>6</w:t>
                         </w:r>
                         <w:r>
                           <w:rPr>
@@ -1725,6 +2500,7 @@
                         <w:tabs>
                           <w:tab w:val="right" w:leader="hyphen" w:pos="10722"/>
                         </w:tabs>
+                        <w:ind w:left="0" w:firstLine="0"/>
                         <w:jc w:val="both"/>
                         <w:rPr>
                           <w:rFonts w:asciiTheme="minorHAnsi" w:eastAsiaTheme="minorEastAsia" w:hAnsiTheme="minorHAnsi" w:cstheme="minorBidi"/>
@@ -1734,6 +2510,9 @@
                           <w:lang w:val="en-US" w:eastAsia="en-US"/>
                         </w:rPr>
                       </w:pPr>
+                      <w:r>
+                        <w:t xml:space="preserve">              </w:t>
+                      </w:r>
                       <w:hyperlink w:anchor="_Toc227927095" w:history="1">
                         <w:r>
                           <w:rPr>
@@ -1781,7 +2560,7 @@
                             <w:noProof/>
                             <w:webHidden/>
                           </w:rPr>
-                          <w:t>5</w:t>
+                          <w:t>6</w:t>
                         </w:r>
                         <w:r>
                           <w:rPr>
@@ -1798,6 +2577,7 @@
                         <w:tabs>
                           <w:tab w:val="right" w:leader="hyphen" w:pos="10722"/>
                         </w:tabs>
+                        <w:ind w:left="0" w:firstLine="0"/>
                         <w:jc w:val="both"/>
                         <w:rPr>
                           <w:rFonts w:asciiTheme="minorHAnsi" w:eastAsiaTheme="minorEastAsia" w:hAnsiTheme="minorHAnsi" w:cstheme="minorBidi"/>
@@ -1807,6 +2587,9 @@
                           <w:lang w:val="en-US" w:eastAsia="en-US"/>
                         </w:rPr>
                       </w:pPr>
+                      <w:r>
+                        <w:t xml:space="preserve">              </w:t>
+                      </w:r>
                       <w:hyperlink w:anchor="_Toc227927096" w:history="1">
                         <w:r>
                           <w:rPr>
@@ -1854,7 +2637,7 @@
                             <w:noProof/>
                             <w:webHidden/>
                           </w:rPr>
-                          <w:t>5</w:t>
+                          <w:t>6</w:t>
                         </w:r>
                         <w:r>
                           <w:rPr>
@@ -1871,6 +2654,7 @@
                         <w:tabs>
                           <w:tab w:val="right" w:leader="hyphen" w:pos="10722"/>
                         </w:tabs>
+                        <w:ind w:left="0" w:firstLine="0"/>
                         <w:jc w:val="both"/>
                         <w:rPr>
                           <w:rFonts w:asciiTheme="minorHAnsi" w:eastAsiaTheme="minorEastAsia" w:hAnsiTheme="minorHAnsi" w:cstheme="minorBidi"/>
@@ -1880,6 +2664,9 @@
                           <w:lang w:val="en-US" w:eastAsia="en-US"/>
                         </w:rPr>
                       </w:pPr>
+                      <w:r>
+                        <w:t xml:space="preserve">              </w:t>
+                      </w:r>
                       <w:hyperlink w:anchor="_Toc227927097" w:history="1">
                         <w:r>
                           <w:rPr>
@@ -1927,7 +2714,7 @@
                             <w:noProof/>
                             <w:webHidden/>
                           </w:rPr>
-                          <w:t>5</w:t>
+                          <w:t>6</w:t>
                         </w:r>
                         <w:r>
                           <w:rPr>
@@ -1944,6 +2731,7 @@
                         <w:tabs>
                           <w:tab w:val="right" w:leader="hyphen" w:pos="10722"/>
                         </w:tabs>
+                        <w:ind w:left="0" w:firstLine="0"/>
                         <w:rPr>
                           <w:rFonts w:asciiTheme="minorHAnsi" w:eastAsiaTheme="minorEastAsia" w:hAnsiTheme="minorHAnsi" w:cstheme="minorBidi"/>
                           <w:noProof/>
@@ -1999,7 +2787,7 @@
                             <w:noProof/>
                             <w:webHidden/>
                           </w:rPr>
-                          <w:t>6</w:t>
+                          <w:t>7</w:t>
                         </w:r>
                         <w:r>
                           <w:rPr>
@@ -2016,6 +2804,7 @@
                         <w:tabs>
                           <w:tab w:val="right" w:leader="hyphen" w:pos="10722"/>
                         </w:tabs>
+                        <w:ind w:left="0" w:firstLine="0"/>
                         <w:rPr>
                           <w:rFonts w:asciiTheme="minorHAnsi" w:eastAsiaTheme="minorEastAsia" w:hAnsiTheme="minorHAnsi" w:cstheme="minorBidi"/>
                           <w:noProof/>
@@ -2024,6 +2813,9 @@
                           <w:lang w:val="en-US" w:eastAsia="en-US"/>
                         </w:rPr>
                       </w:pPr>
+                      <w:r>
+                        <w:t xml:space="preserve">         </w:t>
+                      </w:r>
                       <w:hyperlink w:anchor="_Toc227927099" w:history="1">
                         <w:r>
                           <w:rPr>
@@ -2071,7 +2863,7 @@
                             <w:noProof/>
                             <w:webHidden/>
                           </w:rPr>
-                          <w:t>7</w:t>
+                          <w:t>8</w:t>
                         </w:r>
                         <w:r>
                           <w:rPr>
@@ -2088,6 +2880,7 @@
                         <w:tabs>
                           <w:tab w:val="right" w:leader="hyphen" w:pos="10722"/>
                         </w:tabs>
+                        <w:ind w:left="0" w:firstLine="0"/>
                         <w:rPr>
                           <w:rFonts w:asciiTheme="minorHAnsi" w:eastAsiaTheme="minorEastAsia" w:hAnsiTheme="minorHAnsi" w:cstheme="minorBidi"/>
                           <w:noProof/>
@@ -2143,7 +2936,7 @@
                             <w:noProof/>
                             <w:webHidden/>
                           </w:rPr>
-                          <w:t>7</w:t>
+                          <w:t>8</w:t>
                         </w:r>
                         <w:r>
                           <w:rPr>
@@ -2160,6 +2953,7 @@
                         <w:tabs>
                           <w:tab w:val="right" w:leader="hyphen" w:pos="10722"/>
                         </w:tabs>
+                        <w:ind w:left="0" w:firstLine="0"/>
                         <w:rPr>
                           <w:rFonts w:asciiTheme="minorHAnsi" w:eastAsiaTheme="minorEastAsia" w:hAnsiTheme="minorHAnsi" w:cstheme="minorBidi"/>
                           <w:noProof/>
@@ -2215,7 +3009,7 @@
                             <w:noProof/>
                             <w:webHidden/>
                           </w:rPr>
-                          <w:t>8</w:t>
+                          <w:t>9</w:t>
                         </w:r>
                         <w:r>
                           <w:rPr>
@@ -2232,6 +3026,7 @@
                         <w:tabs>
                           <w:tab w:val="right" w:leader="hyphen" w:pos="10722"/>
                         </w:tabs>
+                        <w:ind w:left="0" w:firstLine="0"/>
                         <w:rPr>
                           <w:rFonts w:asciiTheme="minorHAnsi" w:eastAsiaTheme="minorEastAsia" w:hAnsiTheme="minorHAnsi" w:cstheme="minorBidi"/>
                           <w:noProof/>
@@ -2240,6 +3035,9 @@
                           <w:lang w:val="en-US" w:eastAsia="en-US"/>
                         </w:rPr>
                       </w:pPr>
+                      <w:r>
+                        <w:t xml:space="preserve">           </w:t>
+                      </w:r>
                       <w:hyperlink w:anchor="_Toc227927102" w:history="1">
                         <w:r>
                           <w:rPr>
@@ -2287,7 +3085,7 @@
                             <w:noProof/>
                             <w:webHidden/>
                           </w:rPr>
-                          <w:t>8</w:t>
+                          <w:t>9</w:t>
                         </w:r>
                         <w:r>
                           <w:rPr>
@@ -2304,6 +3102,7 @@
                         <w:tabs>
                           <w:tab w:val="right" w:leader="hyphen" w:pos="10722"/>
                         </w:tabs>
+                        <w:ind w:left="0" w:firstLine="0"/>
                         <w:rPr>
                           <w:rFonts w:asciiTheme="minorHAnsi" w:eastAsiaTheme="minorEastAsia" w:hAnsiTheme="minorHAnsi" w:cstheme="minorBidi"/>
                           <w:noProof/>
@@ -2359,7 +3158,7 @@
                             <w:noProof/>
                             <w:webHidden/>
                           </w:rPr>
-                          <w:t>8</w:t>
+                          <w:t>9</w:t>
                         </w:r>
                         <w:r>
                           <w:rPr>
@@ -2376,6 +3175,7 @@
                         <w:tabs>
                           <w:tab w:val="right" w:leader="hyphen" w:pos="10722"/>
                         </w:tabs>
+                        <w:ind w:left="0" w:firstLine="0"/>
                         <w:rPr>
                           <w:rFonts w:asciiTheme="minorHAnsi" w:eastAsiaTheme="minorEastAsia" w:hAnsiTheme="minorHAnsi" w:cstheme="minorBidi"/>
                           <w:noProof/>
@@ -2431,7 +3231,7 @@
                             <w:noProof/>
                             <w:webHidden/>
                           </w:rPr>
-                          <w:t>9</w:t>
+                          <w:t>10</w:t>
                         </w:r>
                         <w:r>
                           <w:rPr>
@@ -2452,6 +3252,7 @@
                     </w:p>
                   </w:txbxContent>
                 </v:textbox>
+                <w10:wrap anchorx="margin"/>
               </v:shape>
             </w:pict>
           </mc:Fallback>
@@ -3527,7 +4328,6 @@
       <w:r>
         <w:rPr>
           <w:noProof/>
-          <w:lang w:val="en-US" w:eastAsia="en-US"/>
         </w:rPr>
         <w:drawing>
           <wp:inline distT="0" distB="0" distL="0" distR="0" wp14:anchorId="4C11DD87" wp14:editId="646C624D">
@@ -3545,7 +4345,7 @@
                     <pic:cNvPicPr/>
                   </pic:nvPicPr>
                   <pic:blipFill>
-                    <a:blip r:embed="rId8">
+                    <a:blip r:embed="rId9">
                       <a:extLst>
                         <a:ext uri="{28A0092B-C50C-407E-A947-70E740481C1C}">
                           <a14:useLocalDpi xmlns:a14="http://schemas.microsoft.com/office/drawing/2010/main" val="0"/>
@@ -3949,9 +4749,9 @@
       </w:r>
     </w:p>
     <w:sectPr>
-      <w:footerReference w:type="even" r:id="rId9"/>
-      <w:footerReference w:type="default" r:id="rId10"/>
-      <w:footerReference w:type="first" r:id="rId11"/>
+      <w:footerReference w:type="even" r:id="rId10"/>
+      <w:footerReference w:type="default" r:id="rId11"/>
+      <w:footerReference w:type="first" r:id="rId12"/>
       <w:pgSz w:w="11906" w:h="16838"/>
       <w:pgMar w:top="826" w:right="65" w:bottom="706" w:left="1109" w:header="720" w:footer="720" w:gutter="0"/>
       <w:pgNumType w:start="2"/>
@@ -3963,7 +4763,7 @@
 </file>
 
 <file path=word/endnotes.xml><?xml version="1.0" encoding="utf-8"?>
-<w:endnotes xmlns:wpc="http://schemas.microsoft.com/office/word/2010/wordprocessingCanvas" xmlns:cx="http://schemas.microsoft.com/office/drawing/2014/chartex" xmlns:mc="http://schemas.openxmlformats.org/markup-compatibility/2006" xmlns:o="urn:schemas-microsoft-com:office:office" xmlns:r="http://schemas.openxmlformats.org/officeDocument/2006/relationships" xmlns:m="http://schemas.openxmlformats.org/officeDocument/2006/math" xmlns:v="urn:schemas-microsoft-com:vml" xmlns:wp14="http://schemas.microsoft.com/office/word/2010/wordprocessingDrawing" xmlns:wp="http://schemas.openxmlformats.org/drawingml/2006/wordprocessingDrawing" xmlns:w10="urn:schemas-microsoft-com:office:word" xmlns:w="http://schemas.openxmlformats.org/wordprocessingml/2006/main" xmlns:w14="http://schemas.microsoft.com/office/word/2010/wordml" xmlns:w15="http://schemas.microsoft.com/office/word/2012/wordml" xmlns:w16se="http://schemas.microsoft.com/office/word/2015/wordml/symex" xmlns:wpg="http://schemas.microsoft.com/office/word/2010/wordprocessingGroup" xmlns:wpi="http://schemas.microsoft.com/office/word/2010/wordprocessingInk" xmlns:wne="http://schemas.microsoft.com/office/word/2006/wordml" xmlns:wps="http://schemas.microsoft.com/office/word/2010/wordprocessingShape" mc:Ignorable="w14 w15 w16se wp14">
+<w:endnotes xmlns:wpc="http://schemas.microsoft.com/office/word/2010/wordprocessingCanvas" xmlns:mc="http://schemas.openxmlformats.org/markup-compatibility/2006" xmlns:o="urn:schemas-microsoft-com:office:office" xmlns:r="http://schemas.openxmlformats.org/officeDocument/2006/relationships" xmlns:m="http://schemas.openxmlformats.org/officeDocument/2006/math" xmlns:v="urn:schemas-microsoft-com:vml" xmlns:wp14="http://schemas.microsoft.com/office/word/2010/wordprocessingDrawing" xmlns:wp="http://schemas.openxmlformats.org/drawingml/2006/wordprocessingDrawing" xmlns:w10="urn:schemas-microsoft-com:office:word" xmlns:w="http://schemas.openxmlformats.org/wordprocessingml/2006/main" xmlns:w14="http://schemas.microsoft.com/office/word/2010/wordml" xmlns:w15="http://schemas.microsoft.com/office/word/2012/wordml" xmlns:wpg="http://schemas.microsoft.com/office/word/2010/wordprocessingGroup" xmlns:wpi="http://schemas.microsoft.com/office/word/2010/wordprocessingInk" xmlns:wne="http://schemas.microsoft.com/office/word/2006/wordml" xmlns:wps="http://schemas.microsoft.com/office/word/2010/wordprocessingShape" mc:Ignorable="w14 w15 wp14">
   <w:endnote w:type="separator" w:id="-1">
     <w:p>
       <w:pPr>
@@ -3988,7 +4788,7 @@
 </file>
 
 <file path=word/footer1.xml><?xml version="1.0" encoding="utf-8"?>
-<w:ftr xmlns:wpc="http://schemas.microsoft.com/office/word/2010/wordprocessingCanvas" xmlns:cx="http://schemas.microsoft.com/office/drawing/2014/chartex" xmlns:mc="http://schemas.openxmlformats.org/markup-compatibility/2006" xmlns:o="urn:schemas-microsoft-com:office:office" xmlns:r="http://schemas.openxmlformats.org/officeDocument/2006/relationships" xmlns:m="http://schemas.openxmlformats.org/officeDocument/2006/math" xmlns:v="urn:schemas-microsoft-com:vml" xmlns:wp14="http://schemas.microsoft.com/office/word/2010/wordprocessingDrawing" xmlns:wp="http://schemas.openxmlformats.org/drawingml/2006/wordprocessingDrawing" xmlns:w10="urn:schemas-microsoft-com:office:word" xmlns:w="http://schemas.openxmlformats.org/wordprocessingml/2006/main" xmlns:w14="http://schemas.microsoft.com/office/word/2010/wordml" xmlns:w15="http://schemas.microsoft.com/office/word/2012/wordml" xmlns:w16se="http://schemas.microsoft.com/office/word/2015/wordml/symex" xmlns:wpg="http://schemas.microsoft.com/office/word/2010/wordprocessingGroup" xmlns:wpi="http://schemas.microsoft.com/office/word/2010/wordprocessingInk" xmlns:wne="http://schemas.microsoft.com/office/word/2006/wordml" xmlns:wps="http://schemas.microsoft.com/office/word/2010/wordprocessingShape" mc:Ignorable="w14 w15 w16se wp14">
+<w:ftr xmlns:wpc="http://schemas.microsoft.com/office/word/2010/wordprocessingCanvas" xmlns:mc="http://schemas.openxmlformats.org/markup-compatibility/2006" xmlns:o="urn:schemas-microsoft-com:office:office" xmlns:r="http://schemas.openxmlformats.org/officeDocument/2006/relationships" xmlns:m="http://schemas.openxmlformats.org/officeDocument/2006/math" xmlns:v="urn:schemas-microsoft-com:vml" xmlns:wp14="http://schemas.microsoft.com/office/word/2010/wordprocessingDrawing" xmlns:wp="http://schemas.openxmlformats.org/drawingml/2006/wordprocessingDrawing" xmlns:w10="urn:schemas-microsoft-com:office:word" xmlns:w="http://schemas.openxmlformats.org/wordprocessingml/2006/main" xmlns:w14="http://schemas.microsoft.com/office/word/2010/wordml" xmlns:w15="http://schemas.microsoft.com/office/word/2012/wordml" xmlns:wpg="http://schemas.microsoft.com/office/word/2010/wordprocessingGroup" xmlns:wpi="http://schemas.microsoft.com/office/word/2010/wordprocessingInk" xmlns:wne="http://schemas.microsoft.com/office/word/2006/wordml" xmlns:wps="http://schemas.microsoft.com/office/word/2010/wordprocessingShape" mc:Ignorable="w14 w15 wp14">
   <w:p>
     <w:pPr>
       <w:spacing w:after="0" w:line="240" w:lineRule="auto"/>
@@ -4000,7 +4800,6 @@
         <w:rFonts w:ascii="Calibri" w:eastAsia="Calibri" w:hAnsi="Calibri" w:cs="Calibri"/>
         <w:noProof/>
         <w:sz w:val="22"/>
-        <w:lang w:val="en-US" w:eastAsia="en-US"/>
       </w:rPr>
       <mc:AlternateContent>
         <mc:Choice Requires="wpg">
@@ -4233,8 +5032,8 @@
         </mc:Choice>
         <mc:Fallback>
           <w:pict>
-            <v:group id="Group 7686" o:spid="_x0000_s1027" style="position:absolute;margin-left:540.1pt;margin-top:794.6pt;width:25.45pt;height:24pt;z-index:251658240;mso-position-horizontal-relative:page;mso-position-vertical-relative:page" coordsize="323393,305105" o:gfxdata="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">
-              <v:rect id="Rectangle 7689" o:spid="_x0000_s1028" style="position:absolute;left:115824;top:67742;width:120235;height:241550;visibility:visible;mso-wrap-style:square;v-text-anchor:top" o:gfxdata="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" filled="f" stroked="f">
+            <v:group id="Group 7686" o:spid="_x0000_s1031" style="position:absolute;margin-left:540.1pt;margin-top:794.6pt;width:25.45pt;height:24pt;z-index:251658240;mso-position-horizontal-relative:page;mso-position-vertical-relative:page" coordsize="323393,305105" o:gfxdata="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">
+              <v:rect id="Rectangle 7689" o:spid="_x0000_s1032" style="position:absolute;left:115824;top:67742;width:120235;height:241550;visibility:visible;mso-wrap-style:square;v-text-anchor:top" o:gfxdata="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" filled="f" stroked="f">
                 <v:textbox inset="0,0,0,0">
                   <w:txbxContent>
                     <w:p>
@@ -4271,7 +5070,7 @@
                   </w:txbxContent>
                 </v:textbox>
               </v:rect>
-              <v:rect id="Rectangle 7690" o:spid="_x0000_s1029" style="position:absolute;left:205740;top:67742;width:53596;height:241550;visibility:visible;mso-wrap-style:square;v-text-anchor:top" o:gfxdata="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" filled="f" stroked="f">
+              <v:rect id="Rectangle 7690" o:spid="_x0000_s1033" style="position:absolute;left:205740;top:67742;width:53596;height:241550;visibility:visible;mso-wrap-style:square;v-text-anchor:top" o:gfxdata="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" filled="f" stroked="f">
                 <v:textbox inset="0,0,0,0">
                   <w:txbxContent>
                     <w:p>
@@ -4291,11 +5090,11 @@
                   </w:txbxContent>
                 </v:textbox>
               </v:rect>
-              <v:shape id="Shape 8001" o:spid="_x0000_s1030" style="position:absolute;width:323393;height:18593;visibility:visible;mso-wrap-style:square;v-text-anchor:top" coordsize="323393,18593" o:gfxdata="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" path="m,l323393,r,18593l,18593,,e" fillcolor="#a5a5a5" stroked="f" strokeweight="0">
+              <v:shape id="Shape 8001" o:spid="_x0000_s1034" style="position:absolute;width:323393;height:18593;visibility:visible;mso-wrap-style:square;v-text-anchor:top" coordsize="323393,18593" o:gfxdata="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" path="m,l323393,r,18593l,18593,,e" fillcolor="#a5a5a5" stroked="f" strokeweight="0">
                 <v:stroke miterlimit="83231f" joinstyle="miter"/>
                 <v:path arrowok="t" textboxrect="0,0,323393,18593"/>
               </v:shape>
-              <v:shape id="Shape 8002" o:spid="_x0000_s1031" style="position:absolute;top:260909;width:323393;height:44196;visibility:visible;mso-wrap-style:square;v-text-anchor:top" coordsize="323393,44196" o:gfxdata="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" path="m,l323393,r,44196l,44196,,e" fillcolor="#a5a5a5" stroked="f" strokeweight="0">
+              <v:shape id="Shape 8002" o:spid="_x0000_s1035" style="position:absolute;top:260909;width:323393;height:44196;visibility:visible;mso-wrap-style:square;v-text-anchor:top" coordsize="323393,44196" o:gfxdata="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" path="m,l323393,r,44196l,44196,,e" fillcolor="#a5a5a5" stroked="f" strokeweight="0">
                 <v:stroke miterlimit="83231f" joinstyle="miter"/>
                 <v:path arrowok="t" textboxrect="0,0,323393,44196"/>
               </v:shape>
@@ -4317,7 +5116,7 @@
 </file>
 
 <file path=word/footer2.xml><?xml version="1.0" encoding="utf-8"?>
-<w:ftr xmlns:wpc="http://schemas.microsoft.com/office/word/2010/wordprocessingCanvas" xmlns:cx="http://schemas.microsoft.com/office/drawing/2014/chartex" xmlns:mc="http://schemas.openxmlformats.org/markup-compatibility/2006" xmlns:o="urn:schemas-microsoft-com:office:office" xmlns:r="http://schemas.openxmlformats.org/officeDocument/2006/relationships" xmlns:m="http://schemas.openxmlformats.org/officeDocument/2006/math" xmlns:v="urn:schemas-microsoft-com:vml" xmlns:wp14="http://schemas.microsoft.com/office/word/2010/wordprocessingDrawing" xmlns:wp="http://schemas.openxmlformats.org/drawingml/2006/wordprocessingDrawing" xmlns:w10="urn:schemas-microsoft-com:office:word" xmlns:w="http://schemas.openxmlformats.org/wordprocessingml/2006/main" xmlns:w14="http://schemas.microsoft.com/office/word/2010/wordml" xmlns:w15="http://schemas.microsoft.com/office/word/2012/wordml" xmlns:w16se="http://schemas.microsoft.com/office/word/2015/wordml/symex" xmlns:wpg="http://schemas.microsoft.com/office/word/2010/wordprocessingGroup" xmlns:wpi="http://schemas.microsoft.com/office/word/2010/wordprocessingInk" xmlns:wne="http://schemas.microsoft.com/office/word/2006/wordml" xmlns:wps="http://schemas.microsoft.com/office/word/2010/wordprocessingShape" mc:Ignorable="w14 w15 w16se wp14">
+<w:ftr xmlns:wpc="http://schemas.microsoft.com/office/word/2010/wordprocessingCanvas" xmlns:mc="http://schemas.openxmlformats.org/markup-compatibility/2006" xmlns:o="urn:schemas-microsoft-com:office:office" xmlns:r="http://schemas.openxmlformats.org/officeDocument/2006/relationships" xmlns:m="http://schemas.openxmlformats.org/officeDocument/2006/math" xmlns:v="urn:schemas-microsoft-com:vml" xmlns:wp14="http://schemas.microsoft.com/office/word/2010/wordprocessingDrawing" xmlns:wp="http://schemas.openxmlformats.org/drawingml/2006/wordprocessingDrawing" xmlns:w10="urn:schemas-microsoft-com:office:word" xmlns:w="http://schemas.openxmlformats.org/wordprocessingml/2006/main" xmlns:w14="http://schemas.microsoft.com/office/word/2010/wordml" xmlns:w15="http://schemas.microsoft.com/office/word/2012/wordml" xmlns:wpg="http://schemas.microsoft.com/office/word/2010/wordprocessingGroup" xmlns:wpi="http://schemas.microsoft.com/office/word/2010/wordprocessingInk" xmlns:wne="http://schemas.microsoft.com/office/word/2006/wordml" xmlns:wps="http://schemas.microsoft.com/office/word/2010/wordprocessingShape" mc:Ignorable="w14 w15 wp14">
   <w:p>
     <w:pPr>
       <w:spacing w:after="0" w:line="240" w:lineRule="auto"/>
@@ -4329,7 +5128,6 @@
         <w:rFonts w:ascii="Calibri" w:eastAsia="Calibri" w:hAnsi="Calibri" w:cs="Calibri"/>
         <w:noProof/>
         <w:sz w:val="22"/>
-        <w:lang w:val="en-US" w:eastAsia="en-US"/>
       </w:rPr>
       <mc:AlternateContent>
         <mc:Choice Requires="wpg">
@@ -4397,7 +5195,7 @@
                                 <w:noProof/>
                                 <w:sz w:val="28"/>
                               </w:rPr>
-                              <w:t>9</w:t>
+                              <w:t>10</w:t>
                             </w:r>
                             <w:r>
                               <w:rPr>
@@ -4562,8 +5360,8 @@
         </mc:Choice>
         <mc:Fallback>
           <w:pict>
-            <v:group id="Group 7675" o:spid="_x0000_s1032" style="position:absolute;margin-left:540.1pt;margin-top:794.6pt;width:25.45pt;height:24pt;z-index:251659264;mso-position-horizontal-relative:page;mso-position-vertical-relative:page" coordsize="323393,305105" o:gfxdata="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">
-              <v:rect id="Rectangle 7678" o:spid="_x0000_s1033" style="position:absolute;left:115824;top:67742;width:120235;height:241550;visibility:visible;mso-wrap-style:square;v-text-anchor:top" o:gfxdata="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" filled="f" stroked="f">
+            <v:group id="Group 7675" o:spid="_x0000_s1036" style="position:absolute;margin-left:540.1pt;margin-top:794.6pt;width:25.45pt;height:24pt;z-index:251659264;mso-position-horizontal-relative:page;mso-position-vertical-relative:page" coordsize="323393,305105" o:gfxdata="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">
+              <v:rect id="Rectangle 7678" o:spid="_x0000_s1037" style="position:absolute;left:115824;top:67742;width:120235;height:241550;visibility:visible;mso-wrap-style:square;v-text-anchor:top" o:gfxdata="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" filled="f" stroked="f">
                 <v:textbox inset="0,0,0,0">
                   <w:txbxContent>
                     <w:p>
@@ -4587,7 +5385,7 @@
                           <w:noProof/>
                           <w:sz w:val="28"/>
                         </w:rPr>
-                        <w:t>9</w:t>
+                        <w:t>10</w:t>
                       </w:r>
                       <w:r>
                         <w:rPr>
@@ -4600,7 +5398,7 @@
                   </w:txbxContent>
                 </v:textbox>
               </v:rect>
-              <v:rect id="Rectangle 7679" o:spid="_x0000_s1034" style="position:absolute;left:205740;top:67742;width:53596;height:241550;visibility:visible;mso-wrap-style:square;v-text-anchor:top" o:gfxdata="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" filled="f" stroked="f">
+              <v:rect id="Rectangle 7679" o:spid="_x0000_s1038" style="position:absolute;left:205740;top:67742;width:53596;height:241550;visibility:visible;mso-wrap-style:square;v-text-anchor:top" o:gfxdata="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" filled="f" stroked="f">
                 <v:textbox inset="0,0,0,0">
                   <w:txbxContent>
                     <w:p>
@@ -4620,11 +5418,11 @@
                   </w:txbxContent>
                 </v:textbox>
               </v:rect>
-              <v:shape id="Shape 7999" o:spid="_x0000_s1035" style="position:absolute;width:323393;height:18593;visibility:visible;mso-wrap-style:square;v-text-anchor:top" coordsize="323393,18593" o:gfxdata="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" path="m,l323393,r,18593l,18593,,e" fillcolor="#a5a5a5" stroked="f" strokeweight="0">
+              <v:shape id="Shape 7999" o:spid="_x0000_s1039" style="position:absolute;width:323393;height:18593;visibility:visible;mso-wrap-style:square;v-text-anchor:top" coordsize="323393,18593" o:gfxdata="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" path="m,l323393,r,18593l,18593,,e" fillcolor="#a5a5a5" stroked="f" strokeweight="0">
                 <v:stroke miterlimit="83231f" joinstyle="miter"/>
                 <v:path arrowok="t" textboxrect="0,0,323393,18593"/>
               </v:shape>
-              <v:shape id="Shape 8000" o:spid="_x0000_s1036" style="position:absolute;top:260909;width:323393;height:44196;visibility:visible;mso-wrap-style:square;v-text-anchor:top" coordsize="323393,44196" o:gfxdata="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" path="m,l323393,r,44196l,44196,,e" fillcolor="#a5a5a5" stroked="f" strokeweight="0">
+              <v:shape id="Shape 8000" o:spid="_x0000_s1040" style="position:absolute;top:260909;width:323393;height:44196;visibility:visible;mso-wrap-style:square;v-text-anchor:top" coordsize="323393,44196" o:gfxdata="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" path="m,l323393,r,44196l,44196,,e" fillcolor="#a5a5a5" stroked="f" strokeweight="0">
                 <v:stroke miterlimit="83231f" joinstyle="miter"/>
                 <v:path arrowok="t" textboxrect="0,0,323393,44196"/>
               </v:shape>
@@ -4646,7 +5444,7 @@
 </file>
 
 <file path=word/footer3.xml><?xml version="1.0" encoding="utf-8"?>
-<w:ftr xmlns:wpc="http://schemas.microsoft.com/office/word/2010/wordprocessingCanvas" xmlns:cx="http://schemas.microsoft.com/office/drawing/2014/chartex" xmlns:mc="http://schemas.openxmlformats.org/markup-compatibility/2006" xmlns:o="urn:schemas-microsoft-com:office:office" xmlns:r="http://schemas.openxmlformats.org/officeDocument/2006/relationships" xmlns:m="http://schemas.openxmlformats.org/officeDocument/2006/math" xmlns:v="urn:schemas-microsoft-com:vml" xmlns:wp14="http://schemas.microsoft.com/office/word/2010/wordprocessingDrawing" xmlns:wp="http://schemas.openxmlformats.org/drawingml/2006/wordprocessingDrawing" xmlns:w10="urn:schemas-microsoft-com:office:word" xmlns:w="http://schemas.openxmlformats.org/wordprocessingml/2006/main" xmlns:w14="http://schemas.microsoft.com/office/word/2010/wordml" xmlns:w15="http://schemas.microsoft.com/office/word/2012/wordml" xmlns:w16se="http://schemas.microsoft.com/office/word/2015/wordml/symex" xmlns:wpg="http://schemas.microsoft.com/office/word/2010/wordprocessingGroup" xmlns:wpi="http://schemas.microsoft.com/office/word/2010/wordprocessingInk" xmlns:wne="http://schemas.microsoft.com/office/word/2006/wordml" xmlns:wps="http://schemas.microsoft.com/office/word/2010/wordprocessingShape" mc:Ignorable="w14 w15 w16se wp14">
+<w:ftr xmlns:wpc="http://schemas.microsoft.com/office/word/2010/wordprocessingCanvas" xmlns:mc="http://schemas.openxmlformats.org/markup-compatibility/2006" xmlns:o="urn:schemas-microsoft-com:office:office" xmlns:r="http://schemas.openxmlformats.org/officeDocument/2006/relationships" xmlns:m="http://schemas.openxmlformats.org/officeDocument/2006/math" xmlns:v="urn:schemas-microsoft-com:vml" xmlns:wp14="http://schemas.microsoft.com/office/word/2010/wordprocessingDrawing" xmlns:wp="http://schemas.openxmlformats.org/drawingml/2006/wordprocessingDrawing" xmlns:w10="urn:schemas-microsoft-com:office:word" xmlns:w="http://schemas.openxmlformats.org/wordprocessingml/2006/main" xmlns:w14="http://schemas.microsoft.com/office/word/2010/wordml" xmlns:w15="http://schemas.microsoft.com/office/word/2012/wordml" xmlns:wpg="http://schemas.microsoft.com/office/word/2010/wordprocessingGroup" xmlns:wpi="http://schemas.microsoft.com/office/word/2010/wordprocessingInk" xmlns:wne="http://schemas.microsoft.com/office/word/2006/wordml" xmlns:wps="http://schemas.microsoft.com/office/word/2010/wordprocessingShape" mc:Ignorable="w14 w15 wp14">
   <w:p>
     <w:pPr>
       <w:spacing w:after="0" w:line="276" w:lineRule="auto"/>
@@ -4658,7 +5456,7 @@
 </file>
 
 <file path=word/footnotes.xml><?xml version="1.0" encoding="utf-8"?>
-<w:footnotes xmlns:wpc="http://schemas.microsoft.com/office/word/2010/wordprocessingCanvas" xmlns:cx="http://schemas.microsoft.com/office/drawing/2014/chartex" xmlns:mc="http://schemas.openxmlformats.org/markup-compatibility/2006" xmlns:o="urn:schemas-microsoft-com:office:office" xmlns:r="http://schemas.openxmlformats.org/officeDocument/2006/relationships" xmlns:m="http://schemas.openxmlformats.org/officeDocument/2006/math" xmlns:v="urn:schemas-microsoft-com:vml" xmlns:wp14="http://schemas.microsoft.com/office/word/2010/wordprocessingDrawing" xmlns:wp="http://schemas.openxmlformats.org/drawingml/2006/wordprocessingDrawing" xmlns:w10="urn:schemas-microsoft-com:office:word" xmlns:w="http://schemas.openxmlformats.org/wordprocessingml/2006/main" xmlns:w14="http://schemas.microsoft.com/office/word/2010/wordml" xmlns:w15="http://schemas.microsoft.com/office/word/2012/wordml" xmlns:w16se="http://schemas.microsoft.com/office/word/2015/wordml/symex" xmlns:wpg="http://schemas.microsoft.com/office/word/2010/wordprocessingGroup" xmlns:wpi="http://schemas.microsoft.com/office/word/2010/wordprocessingInk" xmlns:wne="http://schemas.microsoft.com/office/word/2006/wordml" xmlns:wps="http://schemas.microsoft.com/office/word/2010/wordprocessingShape" mc:Ignorable="w14 w15 w16se wp14">
+<w:footnotes xmlns:wpc="http://schemas.microsoft.com/office/word/2010/wordprocessingCanvas" xmlns:mc="http://schemas.openxmlformats.org/markup-compatibility/2006" xmlns:o="urn:schemas-microsoft-com:office:office" xmlns:r="http://schemas.openxmlformats.org/officeDocument/2006/relationships" xmlns:m="http://schemas.openxmlformats.org/officeDocument/2006/math" xmlns:v="urn:schemas-microsoft-com:vml" xmlns:wp14="http://schemas.microsoft.com/office/word/2010/wordprocessingDrawing" xmlns:wp="http://schemas.openxmlformats.org/drawingml/2006/wordprocessingDrawing" xmlns:w10="urn:schemas-microsoft-com:office:word" xmlns:w="http://schemas.openxmlformats.org/wordprocessingml/2006/main" xmlns:w14="http://schemas.microsoft.com/office/word/2010/wordml" xmlns:w15="http://schemas.microsoft.com/office/word/2012/wordml" xmlns:wpg="http://schemas.microsoft.com/office/word/2010/wordprocessingGroup" xmlns:wpi="http://schemas.microsoft.com/office/word/2010/wordprocessingInk" xmlns:wne="http://schemas.microsoft.com/office/word/2006/wordml" xmlns:wps="http://schemas.microsoft.com/office/word/2010/wordprocessingShape" mc:Ignorable="w14 w15 wp14">
   <w:footnote w:type="separator" w:id="-1">
     <w:p>
       <w:pPr>
@@ -4683,8 +5481,8 @@
 </file>
 
 <file path=word/numbering.xml><?xml version="1.0" encoding="utf-8"?>
-<w:numbering xmlns:wpc="http://schemas.microsoft.com/office/word/2010/wordprocessingCanvas" xmlns:cx="http://schemas.microsoft.com/office/drawing/2014/chartex" xmlns:mc="http://schemas.openxmlformats.org/markup-compatibility/2006" xmlns:o="urn:schemas-microsoft-com:office:office" xmlns:r="http://schemas.openxmlformats.org/officeDocument/2006/relationships" xmlns:m="http://schemas.openxmlformats.org/officeDocument/2006/math" xmlns:v="urn:schemas-microsoft-com:vml" xmlns:wp14="http://schemas.microsoft.com/office/word/2010/wordprocessingDrawing" xmlns:wp="http://schemas.openxmlformats.org/drawingml/2006/wordprocessingDrawing" xmlns:w10="urn:schemas-microsoft-com:office:word" xmlns:w="http://schemas.openxmlformats.org/wordprocessingml/2006/main" xmlns:w14="http://schemas.microsoft.com/office/word/2010/wordml" xmlns:w15="http://schemas.microsoft.com/office/word/2012/wordml" xmlns:w16se="http://schemas.microsoft.com/office/word/2015/wordml/symex" xmlns:wpg="http://schemas.microsoft.com/office/word/2010/wordprocessingGroup" xmlns:wpi="http://schemas.microsoft.com/office/word/2010/wordprocessingInk" xmlns:wne="http://schemas.microsoft.com/office/word/2006/wordml" xmlns:wps="http://schemas.microsoft.com/office/word/2010/wordprocessingShape" mc:Ignorable="w14 w15 w16se wp14">
-  <w:abstractNum w:abstractNumId="0" w15:restartNumberingAfterBreak="0">
+<w:numbering xmlns:wpc="http://schemas.microsoft.com/office/word/2010/wordprocessingCanvas" xmlns:mc="http://schemas.openxmlformats.org/markup-compatibility/2006" xmlns:o="urn:schemas-microsoft-com:office:office" xmlns:r="http://schemas.openxmlformats.org/officeDocument/2006/relationships" xmlns:m="http://schemas.openxmlformats.org/officeDocument/2006/math" xmlns:v="urn:schemas-microsoft-com:vml" xmlns:wp14="http://schemas.microsoft.com/office/word/2010/wordprocessingDrawing" xmlns:wp="http://schemas.openxmlformats.org/drawingml/2006/wordprocessingDrawing" xmlns:w10="urn:schemas-microsoft-com:office:word" xmlns:w="http://schemas.openxmlformats.org/wordprocessingml/2006/main" xmlns:w14="http://schemas.microsoft.com/office/word/2010/wordml" xmlns:w15="http://schemas.microsoft.com/office/word/2012/wordml" xmlns:wpg="http://schemas.microsoft.com/office/word/2010/wordprocessingGroup" xmlns:wpi="http://schemas.microsoft.com/office/word/2010/wordprocessingInk" xmlns:wne="http://schemas.microsoft.com/office/word/2006/wordml" xmlns:wps="http://schemas.microsoft.com/office/word/2010/wordprocessingShape" mc:Ignorable="w14 w15 wp14">
+  <w:abstractNum w:abstractNumId="0">
     <w:nsid w:val="061456C3"/>
     <w:multiLevelType w:val="hybridMultilevel"/>
     <w:tmpl w:val="74D0C3BE"/>
@@ -4773,7 +5571,7 @@
       </w:pPr>
     </w:lvl>
   </w:abstractNum>
-  <w:abstractNum w:abstractNumId="1" w15:restartNumberingAfterBreak="0">
+  <w:abstractNum w:abstractNumId="1">
     <w:nsid w:val="06C7200A"/>
     <w:multiLevelType w:val="hybridMultilevel"/>
     <w:tmpl w:val="9BE057B2"/>
@@ -4886,7 +5684,7 @@
       </w:rPr>
     </w:lvl>
   </w:abstractNum>
-  <w:abstractNum w:abstractNumId="2" w15:restartNumberingAfterBreak="0">
+  <w:abstractNum w:abstractNumId="2">
     <w:nsid w:val="08E20122"/>
     <w:multiLevelType w:val="hybridMultilevel"/>
     <w:tmpl w:val="4AC86C6C"/>
@@ -4999,7 +5797,7 @@
       </w:rPr>
     </w:lvl>
   </w:abstractNum>
-  <w:abstractNum w:abstractNumId="3" w15:restartNumberingAfterBreak="0">
+  <w:abstractNum w:abstractNumId="3">
     <w:nsid w:val="10EF6207"/>
     <w:multiLevelType w:val="hybridMultilevel"/>
     <w:tmpl w:val="CFEAE0F2"/>
@@ -5112,7 +5910,7 @@
       </w:rPr>
     </w:lvl>
   </w:abstractNum>
-  <w:abstractNum w:abstractNumId="4" w15:restartNumberingAfterBreak="0">
+  <w:abstractNum w:abstractNumId="4">
     <w:nsid w:val="1A707CD5"/>
     <w:multiLevelType w:val="hybridMultilevel"/>
     <w:tmpl w:val="719E46CE"/>
@@ -5225,7 +6023,7 @@
       </w:rPr>
     </w:lvl>
   </w:abstractNum>
-  <w:abstractNum w:abstractNumId="5" w15:restartNumberingAfterBreak="0">
+  <w:abstractNum w:abstractNumId="5">
     <w:nsid w:val="1C564184"/>
     <w:multiLevelType w:val="hybridMultilevel"/>
     <w:tmpl w:val="2B908390"/>
@@ -5428,7 +6226,7 @@
       </w:rPr>
     </w:lvl>
   </w:abstractNum>
-  <w:abstractNum w:abstractNumId="6" w15:restartNumberingAfterBreak="0">
+  <w:abstractNum w:abstractNumId="6">
     <w:nsid w:val="21AB672A"/>
     <w:multiLevelType w:val="hybridMultilevel"/>
     <w:tmpl w:val="16DC676A"/>
@@ -5541,7 +6339,7 @@
       </w:rPr>
     </w:lvl>
   </w:abstractNum>
-  <w:abstractNum w:abstractNumId="7" w15:restartNumberingAfterBreak="0">
+  <w:abstractNum w:abstractNumId="7">
     <w:nsid w:val="26B05C37"/>
     <w:multiLevelType w:val="hybridMultilevel"/>
     <w:tmpl w:val="FB1E4B3A"/>
@@ -5654,7 +6452,7 @@
       </w:rPr>
     </w:lvl>
   </w:abstractNum>
-  <w:abstractNum w:abstractNumId="8" w15:restartNumberingAfterBreak="0">
+  <w:abstractNum w:abstractNumId="8">
     <w:nsid w:val="2D031012"/>
     <w:multiLevelType w:val="hybridMultilevel"/>
     <w:tmpl w:val="62FE35C8"/>
@@ -5767,7 +6565,7 @@
       </w:rPr>
     </w:lvl>
   </w:abstractNum>
-  <w:abstractNum w:abstractNumId="9" w15:restartNumberingAfterBreak="0">
+  <w:abstractNum w:abstractNumId="9">
     <w:nsid w:val="32BA4463"/>
     <w:multiLevelType w:val="hybridMultilevel"/>
     <w:tmpl w:val="A88EFDF0"/>
@@ -5880,7 +6678,7 @@
       </w:rPr>
     </w:lvl>
   </w:abstractNum>
-  <w:abstractNum w:abstractNumId="10" w15:restartNumberingAfterBreak="0">
+  <w:abstractNum w:abstractNumId="10">
     <w:nsid w:val="34F84938"/>
     <w:multiLevelType w:val="hybridMultilevel"/>
     <w:tmpl w:val="3D960212"/>
@@ -5993,7 +6791,7 @@
       </w:rPr>
     </w:lvl>
   </w:abstractNum>
-  <w:abstractNum w:abstractNumId="11" w15:restartNumberingAfterBreak="0">
+  <w:abstractNum w:abstractNumId="11">
     <w:nsid w:val="4A4C1252"/>
     <w:multiLevelType w:val="hybridMultilevel"/>
     <w:tmpl w:val="0958C23E"/>
@@ -6079,7 +6877,7 @@
       </w:pPr>
     </w:lvl>
   </w:abstractNum>
-  <w:abstractNum w:abstractNumId="12" w15:restartNumberingAfterBreak="0">
+  <w:abstractNum w:abstractNumId="12">
     <w:nsid w:val="55480418"/>
     <w:multiLevelType w:val="hybridMultilevel"/>
     <w:tmpl w:val="9B548BEE"/>
@@ -6192,7 +6990,7 @@
       </w:rPr>
     </w:lvl>
   </w:abstractNum>
-  <w:abstractNum w:abstractNumId="13" w15:restartNumberingAfterBreak="0">
+  <w:abstractNum w:abstractNumId="13">
     <w:nsid w:val="6B904BEB"/>
     <w:multiLevelType w:val="hybridMultilevel"/>
     <w:tmpl w:val="6922D700"/>
@@ -6281,7 +7079,7 @@
       </w:pPr>
     </w:lvl>
   </w:abstractNum>
-  <w:abstractNum w:abstractNumId="14" w15:restartNumberingAfterBreak="0">
+  <w:abstractNum w:abstractNumId="14">
     <w:nsid w:val="75C13EF5"/>
     <w:multiLevelType w:val="hybridMultilevel"/>
     <w:tmpl w:val="E84C632A"/>
@@ -6394,7 +7192,7 @@
       </w:rPr>
     </w:lvl>
   </w:abstractNum>
-  <w:abstractNum w:abstractNumId="15" w15:restartNumberingAfterBreak="0">
+  <w:abstractNum w:abstractNumId="15">
     <w:nsid w:val="76894382"/>
     <w:multiLevelType w:val="hybridMultilevel"/>
     <w:tmpl w:val="3048960C"/>
@@ -6507,7 +7305,7 @@
       </w:rPr>
     </w:lvl>
   </w:abstractNum>
-  <w:abstractNum w:abstractNumId="16" w15:restartNumberingAfterBreak="0">
+  <w:abstractNum w:abstractNumId="16">
     <w:nsid w:val="7B6F2B4A"/>
     <w:multiLevelType w:val="hybridMultilevel"/>
     <w:tmpl w:val="CA780282"/>
@@ -6648,7 +7446,7 @@
 </file>
 
 <file path=word/styles.xml><?xml version="1.0" encoding="utf-8"?>
-<w:styles xmlns:mc="http://schemas.openxmlformats.org/markup-compatibility/2006" xmlns:r="http://schemas.openxmlformats.org/officeDocument/2006/relationships" xmlns:w="http://schemas.openxmlformats.org/wordprocessingml/2006/main" xmlns:w14="http://schemas.microsoft.com/office/word/2010/wordml" xmlns:w15="http://schemas.microsoft.com/office/word/2012/wordml" xmlns:w16se="http://schemas.microsoft.com/office/word/2015/wordml/symex" mc:Ignorable="w14 w15 w16se">
+<w:styles xmlns:mc="http://schemas.openxmlformats.org/markup-compatibility/2006" xmlns:r="http://schemas.openxmlformats.org/officeDocument/2006/relationships" xmlns:w="http://schemas.openxmlformats.org/wordprocessingml/2006/main" xmlns:w14="http://schemas.microsoft.com/office/word/2010/wordml" xmlns:w15="http://schemas.microsoft.com/office/word/2012/wordml" mc:Ignorable="w14 w15">
   <w:docDefaults>
     <w:rPrDefault>
       <w:rPr>
@@ -7298,6 +8096,40 @@
       <w:contextualSpacing/>
     </w:pPr>
   </w:style>
+  <w:style w:type="paragraph" w:styleId="Rodap">
+    <w:name w:val="footer"/>
+    <w:basedOn w:val="Normal"/>
+    <w:link w:val="RodapChar"/>
+    <w:uiPriority w:val="99"/>
+    <w:unhideWhenUsed/>
+    <w:rsid w:val="001B3F54"/>
+    <w:pPr>
+      <w:tabs>
+        <w:tab w:val="center" w:pos="4252"/>
+        <w:tab w:val="right" w:pos="8504"/>
+      </w:tabs>
+      <w:spacing w:after="0" w:line="240" w:lineRule="auto"/>
+      <w:ind w:left="0" w:right="0" w:firstLine="0"/>
+      <w:jc w:val="left"/>
+    </w:pPr>
+    <w:rPr>
+      <w:rFonts w:asciiTheme="minorHAnsi" w:eastAsiaTheme="minorHAnsi" w:hAnsiTheme="minorHAnsi" w:cstheme="minorBidi"/>
+      <w:color w:val="auto"/>
+      <w:sz w:val="22"/>
+      <w:lang w:eastAsia="en-US"/>
+    </w:rPr>
+  </w:style>
+  <w:style w:type="character" w:customStyle="1" w:styleId="RodapChar">
+    <w:name w:val="Rodapé Char"/>
+    <w:basedOn w:val="Fontepargpadro"/>
+    <w:link w:val="Rodap"/>
+    <w:uiPriority w:val="99"/>
+    <w:rsid w:val="001B3F54"/>
+    <w:rPr>
+      <w:rFonts w:eastAsiaTheme="minorHAnsi"/>
+      <w:lang w:eastAsia="en-US"/>
+    </w:rPr>
+  </w:style>
 </w:styles>
 </file>
 
@@ -7567,7 +8399,7 @@
 </file>
 
 <file path=customXml/itemProps1.xml><?xml version="1.0" encoding="utf-8"?>
-<ds:datastoreItem xmlns:ds="http://schemas.openxmlformats.org/officeDocument/2006/customXml" ds:itemID="{25D73893-093C-40EE-82DB-4B060EAC33BE}">
+<ds:datastoreItem xmlns:ds="http://schemas.openxmlformats.org/officeDocument/2006/customXml" ds:itemID="{009E4A13-5BE4-4E20-8ECB-229A5D8C8051}">
   <ds:schemaRefs>
     <ds:schemaRef ds:uri="http://schemas.openxmlformats.org/officeDocument/2006/bibliography"/>
   </ds:schemaRefs>

</xml_diff>